<commit_message>
Diario di lavoro e update QdC | 30.01.2026
</commit_message>
<xml_diff>
--- a/1_QdC/QdC_SAMT ALL-STARS.docx
+++ b/1_QdC/QdC_SAMT ALL-STARS.docx
@@ -94,7 +94,7 @@
               </wp:inline>
             </w:drawing>
           </mc:Choice>
-          <mc:Fallback xmlns:w16sdtfl="http://schemas.microsoft.com/office/word/2024/wordml/sdtformatlock" xmlns:w16du="http://schemas.microsoft.com/office/word/2023/wordml/word16du">
+          <mc:Fallback xmlns:w16du="http://schemas.microsoft.com/office/word/2023/wordml/word16du" xmlns:w16sdtfl="http://schemas.microsoft.com/office/word/2024/wordml/sdtformatlock">
             <w:pict>
               <v:group w14:anchorId="70E73CBE" id="docshapegroup5" o:spid="_x0000_s1026" style="width:484.95pt;height:.5pt;mso-position-horizontal-relative:char;mso-position-vertical-relative:line" coordsize="9699,10" o:gfxdata="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">
                 <v:rect id="docshape6" o:spid="_x0000_s1027" style="position:absolute;width:9699;height:10;visibility:visible;mso-wrap-style:square;v-text-anchor:top" o:gfxdata="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" fillcolor="black" stroked="f"/>
@@ -1601,7 +1601,49 @@
                 <w:rFonts w:cstheme="minorHAnsi"/>
                 <w:b/>
               </w:rPr>
-              <w:t>16.01.2026 - 9.06.2026</w:t>
+              <w:t>30</w:t>
+            </w:r>
+            <w:r>
+              <w:rPr>
+                <w:rFonts w:cstheme="minorHAnsi"/>
+                <w:b/>
+              </w:rPr>
+              <w:t xml:space="preserve">.01.2026 - </w:t>
+            </w:r>
+            <w:r>
+              <w:rPr>
+                <w:rFonts w:cstheme="minorHAnsi"/>
+                <w:b/>
+              </w:rPr>
+              <w:t>29</w:t>
+            </w:r>
+            <w:r>
+              <w:rPr>
+                <w:rFonts w:cstheme="minorHAnsi"/>
+                <w:b/>
+              </w:rPr>
+              <w:t>.0</w:t>
+            </w:r>
+            <w:r>
+              <w:rPr>
+                <w:rFonts w:cstheme="minorHAnsi"/>
+                <w:b/>
+              </w:rPr>
+              <w:t>5</w:t>
+            </w:r>
+            <w:r>
+              <w:rPr>
+                <w:rFonts w:cstheme="minorHAnsi"/>
+                <w:b/>
+              </w:rPr>
+              <w:t>.2026</w:t>
+            </w:r>
+            <w:r>
+              <w:rPr>
+                <w:rFonts w:cstheme="minorHAnsi"/>
+                <w:b/>
+              </w:rPr>
+              <w:t xml:space="preserve"> (05.06.2026 - presentazioni)</w:t>
             </w:r>
           </w:p>
         </w:tc>
@@ -2107,7 +2149,7 @@
               </wp:anchor>
             </w:drawing>
           </mc:Choice>
-          <mc:Fallback xmlns:w16sdtfl="http://schemas.microsoft.com/office/word/2024/wordml/sdtformatlock" xmlns:w16du="http://schemas.microsoft.com/office/word/2023/wordml/word16du">
+          <mc:Fallback xmlns:w16du="http://schemas.microsoft.com/office/word/2023/wordml/word16du" xmlns:w16sdtfl="http://schemas.microsoft.com/office/word/2024/wordml/sdtformatlock">
             <w:pict>
               <v:rect w14:anchorId="1FBCB042" id="docshape7" o:spid="_x0000_s1026" style="position:absolute;margin-left:55.2pt;margin-top:18.6pt;width:484.9pt;height:.5pt;z-index:-15728128;visibility:visible;mso-wrap-style:square;mso-width-percent:0;mso-height-percent:0;mso-wrap-distance-left:0;mso-wrap-distance-top:0;mso-wrap-distance-right:0;mso-wrap-distance-bottom:0;mso-position-horizontal:absolute;mso-position-horizontal-relative:page;mso-position-vertical:absolute;mso-position-vertical-relative:text;mso-width-percent:0;mso-height-percent:0;mso-width-relative:page;mso-height-relative:page;v-text-anchor:top" o:gfxdata="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" fillcolor="black" stroked="f">
                 <w10:wrap type="topAndBottom" anchorx="page"/>
@@ -3082,7 +3124,7 @@
               </wp:inline>
             </w:drawing>
           </mc:Choice>
-          <mc:Fallback xmlns:w16sdtfl="http://schemas.microsoft.com/office/word/2024/wordml/sdtformatlock" xmlns:w16du="http://schemas.microsoft.com/office/word/2023/wordml/word16du">
+          <mc:Fallback xmlns:w16du="http://schemas.microsoft.com/office/word/2023/wordml/word16du" xmlns:w16sdtfl="http://schemas.microsoft.com/office/word/2024/wordml/sdtformatlock">
             <w:pict>
               <v:group w14:anchorId="2E328116" id="docshapegroup8" o:spid="_x0000_s1026" style="width:484.95pt;height:.5pt;mso-position-horizontal-relative:char;mso-position-vertical-relative:line" coordsize="9699,10" o:gfxdata="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">
                 <v:rect id="docshape9" o:spid="_x0000_s1027" style="position:absolute;width:9699;height:10;visibility:visible;mso-wrap-style:square;v-text-anchor:top" o:gfxdata="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" fillcolor="black" stroked="f"/>
@@ -3209,7 +3251,7 @@
               </wp:anchor>
             </w:drawing>
           </mc:Choice>
-          <mc:Fallback xmlns:w16sdtfl="http://schemas.microsoft.com/office/word/2024/wordml/sdtformatlock" xmlns:w16du="http://schemas.microsoft.com/office/word/2023/wordml/word16du">
+          <mc:Fallback xmlns:w16du="http://schemas.microsoft.com/office/word/2023/wordml/word16du" xmlns:w16sdtfl="http://schemas.microsoft.com/office/word/2024/wordml/sdtformatlock">
             <w:pict>
               <v:rect w14:anchorId="73131EAD" id="docshape10" o:spid="_x0000_s1026" style="position:absolute;margin-left:55.2pt;margin-top:18.05pt;width:484.9pt;height:.5pt;z-index:-15721472;visibility:visible;mso-wrap-style:square;mso-width-percent:0;mso-height-percent:0;mso-wrap-distance-left:0;mso-wrap-distance-top:0;mso-wrap-distance-right:0;mso-wrap-distance-bottom:0;mso-position-horizontal:absolute;mso-position-horizontal-relative:page;mso-position-vertical:absolute;mso-position-vertical-relative:text;mso-width-percent:0;mso-height-percent:0;mso-width-relative:page;mso-height-relative:page;v-text-anchor:top" o:gfxdata="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" fillcolor="black" stroked="f">
                 <w10:wrap type="topAndBottom" anchorx="page"/>
@@ -3390,7 +3432,7 @@
               </wp:anchor>
             </w:drawing>
           </mc:Choice>
-          <mc:Fallback xmlns:w16sdtfl="http://schemas.microsoft.com/office/word/2024/wordml/sdtformatlock" xmlns:w16du="http://schemas.microsoft.com/office/word/2023/wordml/word16du">
+          <mc:Fallback xmlns:w16du="http://schemas.microsoft.com/office/word/2023/wordml/word16du" xmlns:w16sdtfl="http://schemas.microsoft.com/office/word/2024/wordml/sdtformatlock">
             <w:pict>
               <v:rect w14:anchorId="1A8AD331" id="docshape11" o:spid="_x0000_s1026" style="position:absolute;margin-left:55.2pt;margin-top:18.1pt;width:484.9pt;height:.5pt;z-index:-15720448;visibility:visible;mso-wrap-style:square;mso-width-percent:0;mso-height-percent:0;mso-wrap-distance-left:0;mso-wrap-distance-top:0;mso-wrap-distance-right:0;mso-wrap-distance-bottom:0;mso-position-horizontal:absolute;mso-position-horizontal-relative:page;mso-position-vertical:absolute;mso-position-vertical-relative:text;mso-width-percent:0;mso-height-percent:0;mso-width-relative:page;mso-height-relative:page;v-text-anchor:top" o:gfxdata="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" fillcolor="black" stroked="f">
                 <w10:wrap type="topAndBottom" anchorx="page"/>
@@ -3536,7 +3578,7 @@
               </wp:anchor>
             </w:drawing>
           </mc:Choice>
-          <mc:Fallback xmlns:w16sdtfl="http://schemas.microsoft.com/office/word/2024/wordml/sdtformatlock" xmlns:w16du="http://schemas.microsoft.com/office/word/2023/wordml/word16du">
+          <mc:Fallback xmlns:w16du="http://schemas.microsoft.com/office/word/2023/wordml/word16du" xmlns:w16sdtfl="http://schemas.microsoft.com/office/word/2024/wordml/sdtformatlock">
             <w:pict>
               <v:rect w14:anchorId="48EE7F19" id="docshape12" o:spid="_x0000_s1026" style="position:absolute;margin-left:55.2pt;margin-top:18.1pt;width:484.9pt;height:.5pt;z-index:-15719424;visibility:visible;mso-wrap-style:square;mso-width-percent:0;mso-height-percent:0;mso-wrap-distance-left:0;mso-wrap-distance-top:0;mso-wrap-distance-right:0;mso-wrap-distance-bottom:0;mso-position-horizontal:absolute;mso-position-horizontal-relative:page;mso-position-vertical:absolute;mso-position-vertical-relative:text;mso-width-percent:0;mso-height-percent:0;mso-width-relative:page;mso-height-relative:page;v-text-anchor:top" o:gfxdata="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" fillcolor="black" stroked="f">
                 <w10:wrap type="topAndBottom" anchorx="page"/>
@@ -6034,7 +6076,7 @@
           <w:noProof/>
         </w:rPr>
         <w:drawing>
-          <wp:inline distT="0" distB="0" distL="0" distR="0" wp14:anchorId="086D3B53" wp14:editId="7E8644AA">
+          <wp:inline distT="0" distB="0" distL="0" distR="0" wp14:anchorId="086D3B53" wp14:editId="09253149">
             <wp:extent cx="2725387" cy="1460746"/>
             <wp:effectExtent l="0" t="0" r="0" b="6350"/>
             <wp:docPr id="24" name="Immagine 24"/>
@@ -6837,7 +6879,7 @@
           <w:noProof/>
         </w:rPr>
         <w:drawing>
-          <wp:inline distT="0" distB="0" distL="0" distR="0" wp14:anchorId="004C8F6C" wp14:editId="30246011">
+          <wp:inline distT="0" distB="0" distL="0" distR="0" wp14:anchorId="004C8F6C" wp14:editId="3C72549F">
             <wp:extent cx="3003550" cy="1703082"/>
             <wp:effectExtent l="0" t="0" r="6350" b="0"/>
             <wp:docPr id="26" name="Immagine 26"/>
@@ -7596,7 +7638,7 @@
               </wp:anchor>
             </w:drawing>
           </mc:Choice>
-          <mc:Fallback xmlns:w16sdtfl="http://schemas.microsoft.com/office/word/2024/wordml/sdtformatlock" xmlns:w16du="http://schemas.microsoft.com/office/word/2023/wordml/word16du">
+          <mc:Fallback xmlns:w16du="http://schemas.microsoft.com/office/word/2023/wordml/word16du" xmlns:w16sdtfl="http://schemas.microsoft.com/office/word/2024/wordml/sdtformatlock">
             <w:pict>
               <v:rect w14:anchorId="2A0A7705" id="docshape13" o:spid="_x0000_s1026" style="position:absolute;margin-left:55.2pt;margin-top:18.2pt;width:484.9pt;height:.5pt;z-index:-15725568;visibility:visible;mso-wrap-style:square;mso-width-percent:0;mso-height-percent:0;mso-wrap-distance-left:0;mso-wrap-distance-top:0;mso-wrap-distance-right:0;mso-wrap-distance-bottom:0;mso-position-horizontal:absolute;mso-position-horizontal-relative:page;mso-position-vertical:absolute;mso-position-vertical-relative:text;mso-width-percent:0;mso-height-percent:0;mso-width-relative:page;mso-height-relative:page;v-text-anchor:top" o:gfxdata="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" fillcolor="black" stroked="f">
                 <w10:wrap type="topAndBottom" anchorx="page"/>
@@ -8038,7 +8080,7 @@
               </wp:anchor>
             </w:drawing>
           </mc:Choice>
-          <mc:Fallback xmlns:w16sdtfl="http://schemas.microsoft.com/office/word/2024/wordml/sdtformatlock" xmlns:w16du="http://schemas.microsoft.com/office/word/2023/wordml/word16du">
+          <mc:Fallback xmlns:w16du="http://schemas.microsoft.com/office/word/2023/wordml/word16du" xmlns:w16sdtfl="http://schemas.microsoft.com/office/word/2024/wordml/sdtformatlock">
             <w:pict>
               <v:rect w14:anchorId="2FFC1467" id="docshape14" o:spid="_x0000_s1026" style="position:absolute;margin-left:55.2pt;margin-top:18.2pt;width:484.9pt;height:.5pt;z-index:-15725056;visibility:visible;mso-wrap-style:square;mso-width-percent:0;mso-height-percent:0;mso-wrap-distance-left:0;mso-wrap-distance-top:0;mso-wrap-distance-right:0;mso-wrap-distance-bottom:0;mso-position-horizontal:absolute;mso-position-horizontal-relative:page;mso-position-vertical:absolute;mso-position-vertical-relative:text;mso-width-percent:0;mso-height-percent:0;mso-width-relative:page;mso-height-relative:page;v-text-anchor:top" o:gfxdata="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" fillcolor="black" stroked="f">
                 <w10:wrap type="topAndBottom" anchorx="page"/>
@@ -8520,7 +8562,7 @@
               </wp:inline>
             </w:drawing>
           </mc:Choice>
-          <mc:Fallback xmlns:w16sdtfl="http://schemas.microsoft.com/office/word/2024/wordml/sdtformatlock" xmlns:w16du="http://schemas.microsoft.com/office/word/2023/wordml/word16du">
+          <mc:Fallback xmlns:w16du="http://schemas.microsoft.com/office/word/2023/wordml/word16du" xmlns:w16sdtfl="http://schemas.microsoft.com/office/word/2024/wordml/sdtformatlock">
             <w:pict>
               <v:group w14:anchorId="02693557" id="docshapegroup15" o:spid="_x0000_s1026" style="width:484.95pt;height:.5pt;mso-position-horizontal-relative:char;mso-position-vertical-relative:line" coordsize="9699,10" o:gfxdata="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">
                 <v:rect id="docshape16" o:spid="_x0000_s1027" style="position:absolute;width:9699;height:10;visibility:visible;mso-wrap-style:square;v-text-anchor:top" o:gfxdata="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" fillcolor="black" stroked="f"/>
@@ -8824,7 +8866,7 @@
               </wp:anchor>
             </w:drawing>
           </mc:Choice>
-          <mc:Fallback xmlns:w16sdtfl="http://schemas.microsoft.com/office/word/2024/wordml/sdtformatlock" xmlns:w16du="http://schemas.microsoft.com/office/word/2023/wordml/word16du">
+          <mc:Fallback xmlns:w16du="http://schemas.microsoft.com/office/word/2023/wordml/word16du" xmlns:w16sdtfl="http://schemas.microsoft.com/office/word/2024/wordml/sdtformatlock">
             <w:pict>
               <v:rect w14:anchorId="1F8C973B" id="docshape17" o:spid="_x0000_s1026" style="position:absolute;margin-left:223.25pt;margin-top:12.4pt;width:122.65pt;height:.95pt;z-index:-15724032;visibility:visible;mso-wrap-style:square;mso-width-percent:0;mso-height-percent:0;mso-wrap-distance-left:0;mso-wrap-distance-top:0;mso-wrap-distance-right:0;mso-wrap-distance-bottom:0;mso-position-horizontal:absolute;mso-position-horizontal-relative:page;mso-position-vertical:absolute;mso-position-vertical-relative:text;mso-width-percent:0;mso-height-percent:0;mso-width-relative:page;mso-height-relative:page;v-text-anchor:top" o:gfxdata="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" fillcolor="black" stroked="f">
                 <w10:wrap type="topAndBottom" anchorx="page"/>
@@ -8903,7 +8945,7 @@
               </wp:anchor>
             </w:drawing>
           </mc:Choice>
-          <mc:Fallback xmlns:w16sdtfl="http://schemas.microsoft.com/office/word/2024/wordml/sdtformatlock" xmlns:w16du="http://schemas.microsoft.com/office/word/2023/wordml/word16du">
+          <mc:Fallback xmlns:w16du="http://schemas.microsoft.com/office/word/2023/wordml/word16du" xmlns:w16sdtfl="http://schemas.microsoft.com/office/word/2024/wordml/sdtformatlock">
             <w:pict>
               <v:rect w14:anchorId="5C3318E3" id="docshape18" o:spid="_x0000_s1026" style="position:absolute;margin-left:390.55pt;margin-top:12.4pt;width:122.55pt;height:.95pt;z-index:-15723520;visibility:visible;mso-wrap-style:square;mso-width-percent:0;mso-height-percent:0;mso-wrap-distance-left:0;mso-wrap-distance-top:0;mso-wrap-distance-right:0;mso-wrap-distance-bottom:0;mso-position-horizontal:absolute;mso-position-horizontal-relative:page;mso-position-vertical:absolute;mso-position-vertical-relative:text;mso-width-percent:0;mso-height-percent:0;mso-width-relative:page;mso-height-relative:page;v-text-anchor:top" o:gfxdata="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" fillcolor="black" stroked="f">
                 <w10:wrap type="topAndBottom" anchorx="page"/>

</xml_diff>

<commit_message>
Mockup completati | 27.02.2026
</commit_message>
<xml_diff>
--- a/1_QdC/QdC_SAMT ALL-STARS.docx
+++ b/1_QdC/QdC_SAMT ALL-STARS.docx
@@ -94,7 +94,7 @@
               </wp:inline>
             </w:drawing>
           </mc:Choice>
-          <mc:Fallback xmlns:w16du="http://schemas.microsoft.com/office/word/2023/wordml/word16du" xmlns:w16sdtfl="http://schemas.microsoft.com/office/word/2024/wordml/sdtformatlock">
+          <mc:Fallback xmlns:w16sdtfl="http://schemas.microsoft.com/office/word/2024/wordml/sdtformatlock" xmlns:w16du="http://schemas.microsoft.com/office/word/2023/wordml/word16du">
             <w:pict>
               <v:group w14:anchorId="70E73CBE" id="docshapegroup5" o:spid="_x0000_s1026" style="width:484.95pt;height:.5pt;mso-position-horizontal-relative:char;mso-position-vertical-relative:line" coordsize="9699,10" o:gfxdata="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">
                 <v:rect id="docshape6" o:spid="_x0000_s1027" style="position:absolute;width:9699;height:10;visibility:visible;mso-wrap-style:square;v-text-anchor:top" o:gfxdata="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" fillcolor="black" stroked="f"/>
@@ -2149,7 +2149,7 @@
               </wp:anchor>
             </w:drawing>
           </mc:Choice>
-          <mc:Fallback xmlns:w16du="http://schemas.microsoft.com/office/word/2023/wordml/word16du" xmlns:w16sdtfl="http://schemas.microsoft.com/office/word/2024/wordml/sdtformatlock">
+          <mc:Fallback xmlns:w16sdtfl="http://schemas.microsoft.com/office/word/2024/wordml/sdtformatlock" xmlns:w16du="http://schemas.microsoft.com/office/word/2023/wordml/word16du">
             <w:pict>
               <v:rect w14:anchorId="1FBCB042" id="docshape7" o:spid="_x0000_s1026" style="position:absolute;margin-left:55.2pt;margin-top:18.6pt;width:484.9pt;height:.5pt;z-index:-15728128;visibility:visible;mso-wrap-style:square;mso-width-percent:0;mso-height-percent:0;mso-wrap-distance-left:0;mso-wrap-distance-top:0;mso-wrap-distance-right:0;mso-wrap-distance-bottom:0;mso-position-horizontal:absolute;mso-position-horizontal-relative:page;mso-position-vertical:absolute;mso-position-vertical-relative:text;mso-width-percent:0;mso-height-percent:0;mso-width-relative:page;mso-height-relative:page;v-text-anchor:top" o:gfxdata="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" fillcolor="black" stroked="f">
                 <w10:wrap type="topAndBottom" anchorx="page"/>
@@ -3124,7 +3124,7 @@
               </wp:inline>
             </w:drawing>
           </mc:Choice>
-          <mc:Fallback xmlns:w16du="http://schemas.microsoft.com/office/word/2023/wordml/word16du" xmlns:w16sdtfl="http://schemas.microsoft.com/office/word/2024/wordml/sdtformatlock">
+          <mc:Fallback xmlns:w16sdtfl="http://schemas.microsoft.com/office/word/2024/wordml/sdtformatlock" xmlns:w16du="http://schemas.microsoft.com/office/word/2023/wordml/word16du">
             <w:pict>
               <v:group w14:anchorId="2E328116" id="docshapegroup8" o:spid="_x0000_s1026" style="width:484.95pt;height:.5pt;mso-position-horizontal-relative:char;mso-position-vertical-relative:line" coordsize="9699,10" o:gfxdata="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">
                 <v:rect id="docshape9" o:spid="_x0000_s1027" style="position:absolute;width:9699;height:10;visibility:visible;mso-wrap-style:square;v-text-anchor:top" o:gfxdata="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" fillcolor="black" stroked="f"/>
@@ -3251,7 +3251,7 @@
               </wp:anchor>
             </w:drawing>
           </mc:Choice>
-          <mc:Fallback xmlns:w16du="http://schemas.microsoft.com/office/word/2023/wordml/word16du" xmlns:w16sdtfl="http://schemas.microsoft.com/office/word/2024/wordml/sdtformatlock">
+          <mc:Fallback xmlns:w16sdtfl="http://schemas.microsoft.com/office/word/2024/wordml/sdtformatlock" xmlns:w16du="http://schemas.microsoft.com/office/word/2023/wordml/word16du">
             <w:pict>
               <v:rect w14:anchorId="73131EAD" id="docshape10" o:spid="_x0000_s1026" style="position:absolute;margin-left:55.2pt;margin-top:18.05pt;width:484.9pt;height:.5pt;z-index:-15721472;visibility:visible;mso-wrap-style:square;mso-width-percent:0;mso-height-percent:0;mso-wrap-distance-left:0;mso-wrap-distance-top:0;mso-wrap-distance-right:0;mso-wrap-distance-bottom:0;mso-position-horizontal:absolute;mso-position-horizontal-relative:page;mso-position-vertical:absolute;mso-position-vertical-relative:text;mso-width-percent:0;mso-height-percent:0;mso-width-relative:page;mso-height-relative:page;v-text-anchor:top" o:gfxdata="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" fillcolor="black" stroked="f">
                 <w10:wrap type="topAndBottom" anchorx="page"/>
@@ -3432,7 +3432,7 @@
               </wp:anchor>
             </w:drawing>
           </mc:Choice>
-          <mc:Fallback xmlns:w16du="http://schemas.microsoft.com/office/word/2023/wordml/word16du" xmlns:w16sdtfl="http://schemas.microsoft.com/office/word/2024/wordml/sdtformatlock">
+          <mc:Fallback xmlns:w16sdtfl="http://schemas.microsoft.com/office/word/2024/wordml/sdtformatlock" xmlns:w16du="http://schemas.microsoft.com/office/word/2023/wordml/word16du">
             <w:pict>
               <v:rect w14:anchorId="1A8AD331" id="docshape11" o:spid="_x0000_s1026" style="position:absolute;margin-left:55.2pt;margin-top:18.1pt;width:484.9pt;height:.5pt;z-index:-15720448;visibility:visible;mso-wrap-style:square;mso-width-percent:0;mso-height-percent:0;mso-wrap-distance-left:0;mso-wrap-distance-top:0;mso-wrap-distance-right:0;mso-wrap-distance-bottom:0;mso-position-horizontal:absolute;mso-position-horizontal-relative:page;mso-position-vertical:absolute;mso-position-vertical-relative:text;mso-width-percent:0;mso-height-percent:0;mso-width-relative:page;mso-height-relative:page;v-text-anchor:top" o:gfxdata="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" fillcolor="black" stroked="f">
                 <w10:wrap type="topAndBottom" anchorx="page"/>
@@ -3578,7 +3578,7 @@
               </wp:anchor>
             </w:drawing>
           </mc:Choice>
-          <mc:Fallback xmlns:w16du="http://schemas.microsoft.com/office/word/2023/wordml/word16du" xmlns:w16sdtfl="http://schemas.microsoft.com/office/word/2024/wordml/sdtformatlock">
+          <mc:Fallback xmlns:w16sdtfl="http://schemas.microsoft.com/office/word/2024/wordml/sdtformatlock" xmlns:w16du="http://schemas.microsoft.com/office/word/2023/wordml/word16du">
             <w:pict>
               <v:rect w14:anchorId="48EE7F19" id="docshape12" o:spid="_x0000_s1026" style="position:absolute;margin-left:55.2pt;margin-top:18.1pt;width:484.9pt;height:.5pt;z-index:-15719424;visibility:visible;mso-wrap-style:square;mso-width-percent:0;mso-height-percent:0;mso-wrap-distance-left:0;mso-wrap-distance-top:0;mso-wrap-distance-right:0;mso-wrap-distance-bottom:0;mso-position-horizontal:absolute;mso-position-horizontal-relative:page;mso-position-vertical:absolute;mso-position-vertical-relative:text;mso-width-percent:0;mso-height-percent:0;mso-width-relative:page;mso-height-relative:page;v-text-anchor:top" o:gfxdata="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" fillcolor="black" stroked="f">
                 <w10:wrap type="topAndBottom" anchorx="page"/>
@@ -3768,21 +3768,13 @@
           <w:bCs/>
           <w:lang w:val="it-CH"/>
         </w:rPr>
-        <w:t>abilità speciali e una Ultimate</w:t>
-      </w:r>
-      <w:r>
-        <w:rPr>
-          <w:b/>
-          <w:bCs/>
+        <w:t xml:space="preserve">abilità speciali </w:t>
+      </w:r>
+      <w:r>
+        <w:rPr>
           <w:lang w:val="it-CH"/>
         </w:rPr>
-        <w:t xml:space="preserve"> (possibilmente)</w:t>
-      </w:r>
-      <w:r>
-        <w:rPr>
-          <w:lang w:val="it-CH"/>
-        </w:rPr>
-        <w:t>, bilanciate tramite cooldown, durata e velocità.</w:t>
+        <w:t>bilanciate tramite cooldown, durata e velocità.</w:t>
       </w:r>
     </w:p>
     <w:p>
@@ -4184,7 +4176,13 @@
         <w:contextualSpacing/>
       </w:pPr>
       <w:r>
-        <w:t>Giù:  W || Left Stick</w:t>
+        <w:t xml:space="preserve">Giù: </w:t>
+      </w:r>
+      <w:r>
+        <w:t>S</w:t>
+      </w:r>
+      <w:r>
+        <w:t xml:space="preserve"> || Left Stick</w:t>
       </w:r>
     </w:p>
     <w:p>
@@ -4199,6 +4197,9 @@
         <w:autoSpaceDN/>
         <w:spacing w:after="160" w:line="278" w:lineRule="auto"/>
         <w:contextualSpacing/>
+        <w:rPr>
+          <w:lang w:val="it-CH"/>
+        </w:rPr>
       </w:pPr>
       <w:r>
         <w:t xml:space="preserve">Abilità: E ||  </w:t>
@@ -4208,6 +4209,130 @@
       </w:r>
       <w:r>
         <w:t xml:space="preserve"> / R2</w:t>
+      </w:r>
+      <w:r>
+        <w:rPr>
+          <w:lang w:val="it-CH"/>
+        </w:rPr>
+        <w:br w:type="page"/>
+      </w:r>
+    </w:p>
+    <w:p>
+      <w:pPr>
+        <w:rPr>
+          <w:lang w:val="fr-CH"/>
+        </w:rPr>
+      </w:pPr>
+      <w:r>
+        <w:rPr>
+          <w:lang w:val="fr-CH"/>
+        </w:rPr>
+        <w:lastRenderedPageBreak/>
+        <w:t xml:space="preserve">Quan : </w:t>
+      </w:r>
+    </w:p>
+    <w:p>
+      <w:pPr>
+        <w:pStyle w:val="Paragrafoelenco"/>
+        <w:widowControl/>
+        <w:numPr>
+          <w:ilvl w:val="0"/>
+          <w:numId w:val="31"/>
+        </w:numPr>
+        <w:autoSpaceDE/>
+        <w:autoSpaceDN/>
+        <w:spacing w:after="160" w:line="278" w:lineRule="auto"/>
+        <w:contextualSpacing/>
+      </w:pPr>
+      <w:r>
+        <w:t>Ghosting </w:t>
+      </w:r>
+      <w:r>
+        <w:t>(7s)</w:t>
+      </w:r>
+      <w:r>
+        <w:t>: Quan per un corto p</w:t>
+      </w:r>
+      <w:r>
+        <w:t>eriodo di tempo evita tutto.</w:t>
+      </w:r>
+    </w:p>
+    <w:p>
+      <w:pPr>
+        <w:pStyle w:val="Paragrafoelenco"/>
+        <w:widowControl/>
+        <w:numPr>
+          <w:ilvl w:val="1"/>
+          <w:numId w:val="31"/>
+        </w:numPr>
+        <w:autoSpaceDE/>
+        <w:autoSpaceDN/>
+        <w:spacing w:after="160" w:line="278" w:lineRule="auto"/>
+        <w:contextualSpacing/>
+      </w:pPr>
+      <w:r>
+        <w:t>Diventa un fantasmino (più trasparenza) per 0.25 secondi , durante questo stato non può subire alcun danno (Disattiviamo l’elemento collider).</w:t>
+      </w:r>
+    </w:p>
+    <w:p>
+      <w:r>
+        <w:t>Sidon:</w:t>
+      </w:r>
+    </w:p>
+    <w:p>
+      <w:pPr>
+        <w:pStyle w:val="Paragrafoelenco"/>
+        <w:widowControl/>
+        <w:numPr>
+          <w:ilvl w:val="0"/>
+          <w:numId w:val="31"/>
+        </w:numPr>
+        <w:autoSpaceDE/>
+        <w:autoSpaceDN/>
+        <w:spacing w:after="160" w:line="278" w:lineRule="auto"/>
+        <w:contextualSpacing/>
+      </w:pPr>
+      <w:r>
+        <w:t>Roberto Carlos(13s): Sidon fa uno dei suoi tiri potentissimi facendo danno a tutto ciò che incontra la palla.</w:t>
+      </w:r>
+    </w:p>
+    <w:p>
+      <w:pPr>
+        <w:pStyle w:val="Paragrafoelenco"/>
+        <w:widowControl/>
+        <w:numPr>
+          <w:ilvl w:val="1"/>
+          <w:numId w:val="31"/>
+        </w:numPr>
+        <w:autoSpaceDE/>
+        <w:autoSpaceDN/>
+        <w:spacing w:after="160" w:line="278" w:lineRule="auto"/>
+        <w:contextualSpacing/>
+      </w:pPr>
+      <w:r>
+        <w:t>Tira il pallone che vola avanti orizzontalmente tramite tutta l’arena.</w:t>
+      </w:r>
+    </w:p>
+    <w:p>
+      <w:pPr>
+        <w:pStyle w:val="Paragrafoelenco"/>
+        <w:widowControl/>
+        <w:numPr>
+          <w:ilvl w:val="1"/>
+          <w:numId w:val="31"/>
+        </w:numPr>
+        <w:autoSpaceDE/>
+        <w:autoSpaceDN/>
+        <w:spacing w:after="160" w:line="278" w:lineRule="auto"/>
+        <w:contextualSpacing/>
+      </w:pPr>
+      <w:r>
+        <w:t>25 dmg</w:t>
+      </w:r>
+    </w:p>
+    <w:p>
+      <w:r>
+        <w:t>Yasser:</w:t>
       </w:r>
     </w:p>
     <w:p>
@@ -4224,43 +4349,7 @@
         <w:contextualSpacing/>
       </w:pPr>
       <w:r>
-        <w:t xml:space="preserve">Super: R || </w:t>
-      </w:r>
-      <w:r>
-        <w:rPr>
-          <w:rFonts w:ascii="Cambria Math" w:hAnsi="Cambria Math" w:cs="Cambria Math"/>
-        </w:rPr>
-        <w:t>△</w:t>
-      </w:r>
-      <w:r>
-        <w:t xml:space="preserve"> / L2</w:t>
-      </w:r>
-    </w:p>
-    <w:p>
-      <w:pPr>
-        <w:rPr>
-          <w:lang w:val="it-CH"/>
-        </w:rPr>
-      </w:pPr>
-      <w:r>
-        <w:rPr>
-          <w:lang w:val="it-CH"/>
-        </w:rPr>
-        <w:br w:type="page"/>
-      </w:r>
-    </w:p>
-    <w:p>
-      <w:pPr>
-        <w:rPr>
-          <w:lang w:val="fr-CH"/>
-        </w:rPr>
-      </w:pPr>
-      <w:r>
-        <w:rPr>
-          <w:lang w:val="fr-CH"/>
-        </w:rPr>
-        <w:lastRenderedPageBreak/>
-        <w:t xml:space="preserve">Quan : </w:t>
+        <w:t>LilBoom(11s): Yasser lancia una bomba</w:t>
       </w:r>
     </w:p>
     <w:p>
@@ -4269,7 +4358,7 @@
         <w:widowControl/>
         <w:numPr>
           <w:ilvl w:val="0"/>
-          <w:numId w:val="31"/>
+          <w:numId w:val="32"/>
         </w:numPr>
         <w:autoSpaceDE/>
         <w:autoSpaceDN/>
@@ -4277,16 +4366,7 @@
         <w:contextualSpacing/>
       </w:pPr>
       <w:r>
-        <w:t>Ghosting </w:t>
-      </w:r>
-      <w:r>
-        <w:t>(7s)</w:t>
-      </w:r>
-      <w:r>
-        <w:t>: Quan per un corto p</w:t>
-      </w:r>
-      <w:r>
-        <w:t>eriodo di tempo evita tutto.</w:t>
+        <w:t>Lancia una bomba che esplode a contatto o esplode al secondo tocco per terra</w:t>
       </w:r>
     </w:p>
     <w:p>
@@ -4294,8 +4374,8 @@
         <w:pStyle w:val="Paragrafoelenco"/>
         <w:widowControl/>
         <w:numPr>
-          <w:ilvl w:val="1"/>
-          <w:numId w:val="31"/>
+          <w:ilvl w:val="0"/>
+          <w:numId w:val="32"/>
         </w:numPr>
         <w:autoSpaceDE/>
         <w:autoSpaceDN/>
@@ -4303,170 +4383,12 @@
         <w:contextualSpacing/>
       </w:pPr>
       <w:r>
-        <w:t>Diventa un fantasmino (più trasparenza) per 0.25 secondi , durante questo stato non può subire alcun danno (Disattiviamo l’elemento collider).</w:t>
-      </w:r>
-    </w:p>
-    <w:p>
-      <w:pPr>
-        <w:pStyle w:val="Paragrafoelenco"/>
-        <w:widowControl/>
-        <w:numPr>
-          <w:ilvl w:val="0"/>
-          <w:numId w:val="31"/>
-        </w:numPr>
-        <w:autoSpaceDE/>
-        <w:autoSpaceDN/>
-        <w:spacing w:after="160" w:line="278" w:lineRule="auto"/>
-        <w:contextualSpacing/>
-      </w:pPr>
-      <w:r>
-        <w:t>Judgement Cut:  Quan taglia la materia e il tempo su tutta l’arena facendo danno una volta.</w:t>
-      </w:r>
-    </w:p>
-    <w:p>
-      <w:pPr>
-        <w:pStyle w:val="Paragrafoelenco"/>
-        <w:widowControl/>
-        <w:numPr>
-          <w:ilvl w:val="1"/>
-          <w:numId w:val="31"/>
-        </w:numPr>
-        <w:autoSpaceDE/>
-        <w:autoSpaceDN/>
-        <w:spacing w:after="160" w:line="278" w:lineRule="auto"/>
-        <w:contextualSpacing/>
-      </w:pPr>
-      <w:r>
-        <w:t>Judgment cut di DMC5 (Vergil non sin demon form ultimate)</w:t>
-      </w:r>
-    </w:p>
-    <w:p>
-      <w:pPr>
-        <w:pStyle w:val="Paragrafoelenco"/>
-        <w:widowControl/>
-        <w:numPr>
-          <w:ilvl w:val="1"/>
-          <w:numId w:val="31"/>
-        </w:numPr>
-        <w:autoSpaceDE/>
-        <w:autoSpaceDN/>
-        <w:spacing w:after="160" w:line="278" w:lineRule="auto"/>
-        <w:contextualSpacing/>
-      </w:pPr>
-      <w:r>
-        <w:t>Schermo bianco e nero si ferma il tempo appaiano tagli su tutta la mappa e il personaggio, e quando si riprende si ha 0.1s per schivare con pattern preciso e un safe spot (Abilitiamo una hitzone per una frame).</w:t>
-      </w:r>
-    </w:p>
-    <w:p>
-      <w:pPr>
-        <w:pStyle w:val="Paragrafoelenco"/>
-        <w:widowControl/>
-        <w:numPr>
-          <w:ilvl w:val="1"/>
-          <w:numId w:val="31"/>
-        </w:numPr>
-        <w:autoSpaceDE/>
-        <w:autoSpaceDN/>
-        <w:spacing w:after="160" w:line="278" w:lineRule="auto"/>
-        <w:contextualSpacing/>
-      </w:pPr>
-      <w:r>
-        <w:t>87 dmg</w:t>
-      </w:r>
-    </w:p>
-    <w:p>
-      <w:r>
-        <w:t>Sidon:</w:t>
-      </w:r>
-    </w:p>
-    <w:p>
-      <w:pPr>
-        <w:pStyle w:val="Paragrafoelenco"/>
-        <w:widowControl/>
-        <w:numPr>
-          <w:ilvl w:val="0"/>
-          <w:numId w:val="31"/>
-        </w:numPr>
-        <w:autoSpaceDE/>
-        <w:autoSpaceDN/>
-        <w:spacing w:after="160" w:line="278" w:lineRule="auto"/>
-        <w:contextualSpacing/>
-      </w:pPr>
-      <w:r>
-        <w:t>Roberto Carlos(13s): Sidon fa uno dei suoi tiri potentissimi facendo danno a tutto ciò che incontra la palla.</w:t>
-      </w:r>
-    </w:p>
-    <w:p>
-      <w:pPr>
-        <w:pStyle w:val="Paragrafoelenco"/>
-        <w:widowControl/>
-        <w:numPr>
-          <w:ilvl w:val="1"/>
-          <w:numId w:val="31"/>
-        </w:numPr>
-        <w:autoSpaceDE/>
-        <w:autoSpaceDN/>
-        <w:spacing w:after="160" w:line="278" w:lineRule="auto"/>
-        <w:contextualSpacing/>
-      </w:pPr>
-      <w:r>
-        <w:t>Tira il pallone che vola avanti orizzontalmente tramite tutta l’arena.</w:t>
-      </w:r>
-    </w:p>
-    <w:p>
-      <w:pPr>
-        <w:pStyle w:val="Paragrafoelenco"/>
-        <w:widowControl/>
-        <w:numPr>
-          <w:ilvl w:val="1"/>
-          <w:numId w:val="31"/>
-        </w:numPr>
-        <w:autoSpaceDE/>
-        <w:autoSpaceDN/>
-        <w:spacing w:after="160" w:line="278" w:lineRule="auto"/>
-        <w:contextualSpacing/>
-      </w:pPr>
-      <w:r>
-        <w:t>25 dmg</w:t>
-      </w:r>
-    </w:p>
-    <w:p>
-      <w:pPr>
-        <w:pStyle w:val="Paragrafoelenco"/>
-        <w:widowControl/>
-        <w:numPr>
-          <w:ilvl w:val="0"/>
-          <w:numId w:val="31"/>
-        </w:numPr>
-        <w:autoSpaceDE/>
-        <w:autoSpaceDN/>
-        <w:spacing w:after="160" w:line="278" w:lineRule="auto"/>
-        <w:contextualSpacing/>
-      </w:pPr>
-      <w:r>
-        <w:t>Raffica esplosiva suprema: Sidon salta in aria e calcia 8 palloni in ogni direzione per tutta l’area facendo danno per ogni pallone che esplode al contatto.</w:t>
-      </w:r>
-    </w:p>
-    <w:p>
-      <w:pPr>
-        <w:pStyle w:val="Paragrafoelenco"/>
-        <w:widowControl/>
-        <w:numPr>
-          <w:ilvl w:val="1"/>
-          <w:numId w:val="31"/>
-        </w:numPr>
-        <w:autoSpaceDE/>
-        <w:autoSpaceDN/>
-        <w:spacing w:after="160" w:line="278" w:lineRule="auto"/>
-        <w:contextualSpacing/>
-      </w:pPr>
-      <w:r>
-        <w:t>40 dmg per palla</w:t>
-      </w:r>
-    </w:p>
-    <w:p>
-      <w:r>
-        <w:t>Yasser:</w:t>
+        <w:t>20 dmg</w:t>
+      </w:r>
+    </w:p>
+    <w:p>
+      <w:r>
+        <w:t xml:space="preserve">Ivan: </w:t>
       </w:r>
     </w:p>
     <w:p>
@@ -4483,7 +4405,16 @@
         <w:contextualSpacing/>
       </w:pPr>
       <w:r>
-        <w:t>LilBoom(11s): Yasser lancia una bomba</w:t>
+        <w:t>Pierce Thought(1</w:t>
+      </w:r>
+      <w:r>
+        <w:t>0</w:t>
+      </w:r>
+      <w:r>
+        <w:t xml:space="preserve">s): Ivan </w:t>
+      </w:r>
+      <w:r>
+        <w:t>spara fuori dalla testa parole intelligenti</w:t>
       </w:r>
     </w:p>
     <w:p>
@@ -4500,7 +4431,7 @@
         <w:contextualSpacing/>
       </w:pPr>
       <w:r>
-        <w:t>Lancia una bomba che esplode a contatto o esplode al secondo tocco per terra</w:t>
+        <w:t>3 parole volano in parallelo in direzione di dove si trova il nemico</w:t>
       </w:r>
     </w:p>
     <w:p>
@@ -4517,7 +4448,403 @@
         <w:contextualSpacing/>
       </w:pPr>
       <w:r>
-        <w:t>20 dmg</w:t>
+        <w:t>7 dmg / parola</w:t>
+      </w:r>
+    </w:p>
+    <w:tbl>
+      <w:tblPr>
+        <w:tblStyle w:val="Grigliatabella"/>
+        <w:tblW w:w="9699" w:type="dxa"/>
+        <w:tblInd w:w="284" w:type="dxa"/>
+        <w:tblLook w:val="04A0" w:firstRow="1" w:lastRow="0" w:firstColumn="1" w:lastColumn="0" w:noHBand="0" w:noVBand="1"/>
+      </w:tblPr>
+      <w:tblGrid>
+        <w:gridCol w:w="1826"/>
+        <w:gridCol w:w="1239"/>
+        <w:gridCol w:w="2101"/>
+        <w:gridCol w:w="4533"/>
+      </w:tblGrid>
+      <w:tr>
+        <w:trPr>
+          <w:trHeight w:val="341"/>
+        </w:trPr>
+        <w:tc>
+          <w:tcPr>
+            <w:tcW w:w="1826" w:type="dxa"/>
+          </w:tcPr>
+          <w:p>
+            <w:pPr>
+              <w:pStyle w:val="Corpotesto"/>
+              <w:spacing w:before="56"/>
+            </w:pPr>
+            <w:bookmarkStart w:id="0" w:name="_Hlk220669088"/>
+            <w:r>
+              <w:rPr>
+                <w:b/>
+                <w:bCs/>
+              </w:rPr>
+              <w:t>Nome</w:t>
+            </w:r>
+          </w:p>
+        </w:tc>
+        <w:tc>
+          <w:tcPr>
+            <w:tcW w:w="1239" w:type="dxa"/>
+          </w:tcPr>
+          <w:p>
+            <w:pPr>
+              <w:pStyle w:val="Corpotesto"/>
+              <w:spacing w:before="56"/>
+              <w:jc w:val="center"/>
+            </w:pPr>
+            <w:r>
+              <w:rPr>
+                <w:b/>
+                <w:bCs/>
+              </w:rPr>
+              <w:t>HP</w:t>
+            </w:r>
+          </w:p>
+        </w:tc>
+        <w:tc>
+          <w:tcPr>
+            <w:tcW w:w="2101" w:type="dxa"/>
+          </w:tcPr>
+          <w:p>
+            <w:pPr>
+              <w:pStyle w:val="Corpotesto"/>
+              <w:spacing w:before="56"/>
+              <w:jc w:val="center"/>
+            </w:pPr>
+            <w:r>
+              <w:rPr>
+                <w:b/>
+                <w:bCs/>
+              </w:rPr>
+              <w:t>Velocità</w:t>
+            </w:r>
+          </w:p>
+        </w:tc>
+        <w:tc>
+          <w:tcPr>
+            <w:tcW w:w="4533" w:type="dxa"/>
+          </w:tcPr>
+          <w:p>
+            <w:pPr>
+              <w:pStyle w:val="Corpotesto"/>
+              <w:spacing w:before="56"/>
+              <w:jc w:val="center"/>
+            </w:pPr>
+            <w:r>
+              <w:rPr>
+                <w:b/>
+                <w:bCs/>
+              </w:rPr>
+              <w:t>Abilità</w:t>
+            </w:r>
+          </w:p>
+        </w:tc>
+      </w:tr>
+      <w:tr>
+        <w:trPr>
+          <w:trHeight w:val="347"/>
+        </w:trPr>
+        <w:tc>
+          <w:tcPr>
+            <w:tcW w:w="1826" w:type="dxa"/>
+          </w:tcPr>
+          <w:p>
+            <w:pPr>
+              <w:pStyle w:val="Corpotesto"/>
+              <w:spacing w:before="56"/>
+            </w:pPr>
+            <w:r>
+              <w:t>Quan</w:t>
+            </w:r>
+          </w:p>
+        </w:tc>
+        <w:tc>
+          <w:tcPr>
+            <w:tcW w:w="1239" w:type="dxa"/>
+          </w:tcPr>
+          <w:p>
+            <w:pPr>
+              <w:pStyle w:val="Corpotesto"/>
+              <w:spacing w:before="56"/>
+              <w:jc w:val="center"/>
+            </w:pPr>
+            <w:r>
+              <w:t>200</w:t>
+            </w:r>
+          </w:p>
+        </w:tc>
+        <w:tc>
+          <w:tcPr>
+            <w:tcW w:w="2101" w:type="dxa"/>
+          </w:tcPr>
+          <w:p>
+            <w:pPr>
+              <w:pStyle w:val="Corpotesto"/>
+              <w:spacing w:before="56"/>
+              <w:jc w:val="center"/>
+            </w:pPr>
+            <w:r>
+              <w:t>1.1</w:t>
+            </w:r>
+          </w:p>
+        </w:tc>
+        <w:tc>
+          <w:tcPr>
+            <w:tcW w:w="4533" w:type="dxa"/>
+          </w:tcPr>
+          <w:p>
+            <w:pPr>
+              <w:pStyle w:val="Corpotesto"/>
+              <w:spacing w:before="56"/>
+              <w:jc w:val="center"/>
+            </w:pPr>
+            <w:r>
+              <w:t>Ghosting (7s)</w:t>
+            </w:r>
+          </w:p>
+        </w:tc>
+      </w:tr>
+      <w:tr>
+        <w:trPr>
+          <w:trHeight w:val="347"/>
+        </w:trPr>
+        <w:tc>
+          <w:tcPr>
+            <w:tcW w:w="1826" w:type="dxa"/>
+          </w:tcPr>
+          <w:p>
+            <w:pPr>
+              <w:pStyle w:val="Corpotesto"/>
+              <w:spacing w:before="56"/>
+            </w:pPr>
+            <w:r>
+              <w:t>Sidon</w:t>
+            </w:r>
+          </w:p>
+        </w:tc>
+        <w:tc>
+          <w:tcPr>
+            <w:tcW w:w="1239" w:type="dxa"/>
+          </w:tcPr>
+          <w:p>
+            <w:pPr>
+              <w:pStyle w:val="Corpotesto"/>
+              <w:spacing w:before="56"/>
+              <w:jc w:val="center"/>
+            </w:pPr>
+            <w:r>
+              <w:t>250</w:t>
+            </w:r>
+          </w:p>
+        </w:tc>
+        <w:tc>
+          <w:tcPr>
+            <w:tcW w:w="2101" w:type="dxa"/>
+          </w:tcPr>
+          <w:p>
+            <w:pPr>
+              <w:pStyle w:val="Corpotesto"/>
+              <w:spacing w:before="56"/>
+              <w:jc w:val="center"/>
+            </w:pPr>
+            <w:r>
+              <w:t>1.25</w:t>
+            </w:r>
+          </w:p>
+        </w:tc>
+        <w:tc>
+          <w:tcPr>
+            <w:tcW w:w="4533" w:type="dxa"/>
+          </w:tcPr>
+          <w:p>
+            <w:pPr>
+              <w:pStyle w:val="Corpotesto"/>
+              <w:spacing w:before="56"/>
+              <w:jc w:val="center"/>
+            </w:pPr>
+            <w:r>
+              <w:t>Roberto Carlos (13s)</w:t>
+            </w:r>
+          </w:p>
+        </w:tc>
+      </w:tr>
+      <w:tr>
+        <w:trPr>
+          <w:trHeight w:val="338"/>
+        </w:trPr>
+        <w:tc>
+          <w:tcPr>
+            <w:tcW w:w="1826" w:type="dxa"/>
+          </w:tcPr>
+          <w:p>
+            <w:pPr>
+              <w:pStyle w:val="Corpotesto"/>
+              <w:spacing w:before="56"/>
+            </w:pPr>
+            <w:r>
+              <w:t>Yasser</w:t>
+            </w:r>
+          </w:p>
+        </w:tc>
+        <w:tc>
+          <w:tcPr>
+            <w:tcW w:w="1239" w:type="dxa"/>
+          </w:tcPr>
+          <w:p>
+            <w:pPr>
+              <w:pStyle w:val="Corpotesto"/>
+              <w:spacing w:before="56"/>
+              <w:jc w:val="center"/>
+            </w:pPr>
+            <w:r>
+              <w:t>300</w:t>
+            </w:r>
+          </w:p>
+        </w:tc>
+        <w:tc>
+          <w:tcPr>
+            <w:tcW w:w="2101" w:type="dxa"/>
+          </w:tcPr>
+          <w:p>
+            <w:pPr>
+              <w:pStyle w:val="Corpotesto"/>
+              <w:spacing w:before="56"/>
+              <w:jc w:val="center"/>
+            </w:pPr>
+            <w:r>
+              <w:t>1</w:t>
+            </w:r>
+          </w:p>
+        </w:tc>
+        <w:tc>
+          <w:tcPr>
+            <w:tcW w:w="4533" w:type="dxa"/>
+          </w:tcPr>
+          <w:p>
+            <w:pPr>
+              <w:pStyle w:val="Corpotesto"/>
+              <w:spacing w:before="56"/>
+              <w:jc w:val="center"/>
+            </w:pPr>
+            <w:r>
+              <w:t>LilBoom(11s)</w:t>
+            </w:r>
+          </w:p>
+        </w:tc>
+      </w:tr>
+      <w:tr>
+        <w:trPr>
+          <w:trHeight w:val="347"/>
+        </w:trPr>
+        <w:tc>
+          <w:tcPr>
+            <w:tcW w:w="1826" w:type="dxa"/>
+          </w:tcPr>
+          <w:p>
+            <w:pPr>
+              <w:pStyle w:val="Corpotesto"/>
+              <w:spacing w:before="56"/>
+            </w:pPr>
+            <w:r>
+              <w:t>Ivan</w:t>
+            </w:r>
+          </w:p>
+        </w:tc>
+        <w:tc>
+          <w:tcPr>
+            <w:tcW w:w="1239" w:type="dxa"/>
+          </w:tcPr>
+          <w:p>
+            <w:pPr>
+              <w:pStyle w:val="Corpotesto"/>
+              <w:spacing w:before="56"/>
+              <w:jc w:val="center"/>
+            </w:pPr>
+            <w:r>
+              <w:t>250</w:t>
+            </w:r>
+          </w:p>
+        </w:tc>
+        <w:tc>
+          <w:tcPr>
+            <w:tcW w:w="2101" w:type="dxa"/>
+          </w:tcPr>
+          <w:p>
+            <w:pPr>
+              <w:pStyle w:val="Corpotesto"/>
+              <w:spacing w:before="56"/>
+              <w:jc w:val="center"/>
+            </w:pPr>
+            <w:r>
+              <w:t>1</w:t>
+            </w:r>
+          </w:p>
+        </w:tc>
+        <w:tc>
+          <w:tcPr>
+            <w:tcW w:w="4533" w:type="dxa"/>
+          </w:tcPr>
+          <w:p>
+            <w:pPr>
+              <w:pStyle w:val="Corpotesto"/>
+              <w:spacing w:before="56"/>
+              <w:jc w:val="center"/>
+            </w:pPr>
+            <w:r>
+              <w:t>Pierce Thought (11s)</w:t>
+            </w:r>
+          </w:p>
+        </w:tc>
+      </w:tr>
+      <w:bookmarkEnd w:id="0"/>
+    </w:tbl>
+    <w:p>
+      <w:pPr>
+        <w:rPr>
+          <w:color w:val="000000" w:themeColor="text1"/>
+        </w:rPr>
+      </w:pPr>
+    </w:p>
+    <w:p>
+      <w:pPr>
+        <w:rPr>
+          <w:color w:val="000000" w:themeColor="text1"/>
+        </w:rPr>
+      </w:pPr>
+    </w:p>
+    <w:p>
+      <w:pPr>
+        <w:rPr>
+          <w:color w:val="000000" w:themeColor="text1"/>
+        </w:rPr>
+      </w:pPr>
+      <w:r>
+        <w:rPr>
+          <w:color w:val="000000" w:themeColor="text1"/>
+        </w:rPr>
+        <w:t>Knockback presente come un semplice addForce di rigidBody. Viene applicato soltanto dopo un calcio o l’abilità “Roberto Carlos”.</w:t>
+      </w:r>
+    </w:p>
+    <w:p>
+      <w:pPr>
+        <w:rPr>
+          <w:color w:val="000000" w:themeColor="text1"/>
+        </w:rPr>
+      </w:pPr>
+    </w:p>
+    <w:p>
+      <w:pPr>
+        <w:rPr>
+          <w:lang w:val="it-CH"/>
+        </w:rPr>
+      </w:pPr>
+      <w:r>
+        <w:t>Mappe:</w:t>
       </w:r>
     </w:p>
     <w:p>
@@ -4534,7 +4861,7 @@
         <w:contextualSpacing/>
       </w:pPr>
       <w:r>
-        <w:t>Cannonata: Yasser si fa un cannone e lascia fumo su tutta l’arena</w:t>
+        <w:t>4 Mappe (Tutto resta uguale sono il background cambia):</w:t>
       </w:r>
     </w:p>
     <w:p>
@@ -4542,8 +4869,8 @@
         <w:pStyle w:val="Paragrafoelenco"/>
         <w:widowControl/>
         <w:numPr>
-          <w:ilvl w:val="0"/>
-          <w:numId w:val="32"/>
+          <w:ilvl w:val="1"/>
+          <w:numId w:val="30"/>
         </w:numPr>
         <w:autoSpaceDE/>
         <w:autoSpaceDN/>
@@ -4551,7 +4878,7 @@
         <w:contextualSpacing/>
       </w:pPr>
       <w:r>
-        <w:t>Appare un drum gigante producendo del fumo che gradualmente fa danno occupando tutta l’arena e non si può schivare</w:t>
+        <w:t>Pincode</w:t>
       </w:r>
     </w:p>
     <w:p>
@@ -4559,8 +4886,8 @@
         <w:pStyle w:val="Paragrafoelenco"/>
         <w:widowControl/>
         <w:numPr>
-          <w:ilvl w:val="0"/>
-          <w:numId w:val="32"/>
+          <w:ilvl w:val="1"/>
+          <w:numId w:val="30"/>
         </w:numPr>
         <w:autoSpaceDE/>
         <w:autoSpaceDN/>
@@ -4568,7 +4895,7 @@
         <w:contextualSpacing/>
       </w:pPr>
       <w:r>
-        <w:t>Animazione di 3 secondi in cui fuma e prende 80% meno di danno e per i prossimo 5 secondi il  fumo si espande (Sfera a cui auentiano il size ogni frame).</w:t>
+        <w:t>Bab Al-Hara</w:t>
       </w:r>
     </w:p>
     <w:p>
@@ -4576,8 +4903,8 @@
         <w:pStyle w:val="Paragrafoelenco"/>
         <w:widowControl/>
         <w:numPr>
-          <w:ilvl w:val="0"/>
-          <w:numId w:val="32"/>
+          <w:ilvl w:val="1"/>
+          <w:numId w:val="30"/>
         </w:numPr>
         <w:autoSpaceDE/>
         <w:autoSpaceDN/>
@@ -4585,18 +4912,24 @@
         <w:contextualSpacing/>
       </w:pPr>
       <w:r>
-        <w:t>25 dmg/secondo</w:t>
-      </w:r>
-    </w:p>
-    <w:p>
-      <w:r>
-        <w:br w:type="page"/>
-      </w:r>
-    </w:p>
-    <w:p>
-      <w:r>
-        <w:lastRenderedPageBreak/>
-        <w:t xml:space="preserve">Ivan: </w:t>
+        <w:t>Xiaohongshu</w:t>
+      </w:r>
+    </w:p>
+    <w:p>
+      <w:pPr>
+        <w:pStyle w:val="Paragrafoelenco"/>
+        <w:widowControl/>
+        <w:numPr>
+          <w:ilvl w:val="1"/>
+          <w:numId w:val="30"/>
+        </w:numPr>
+        <w:autoSpaceDE/>
+        <w:autoSpaceDN/>
+        <w:spacing w:after="160" w:line="278" w:lineRule="auto"/>
+        <w:contextualSpacing/>
+      </w:pPr>
+      <w:r>
+        <w:t>Arebaetaotisetik</w:t>
       </w:r>
     </w:p>
     <w:p>
@@ -4613,50 +4946,7 @@
         <w:contextualSpacing/>
       </w:pPr>
       <w:r>
-        <w:t>Pierce Thought(1</w:t>
-      </w:r>
-      <w:r>
-        <w:t>0</w:t>
-      </w:r>
-      <w:r>
-        <w:t xml:space="preserve">s): Ivan </w:t>
-      </w:r>
-      <w:r>
-        <w:t>spara fuori dalla testa parole intelligenti</w:t>
-      </w:r>
-    </w:p>
-    <w:p>
-      <w:pPr>
-        <w:pStyle w:val="Paragrafoelenco"/>
-        <w:widowControl/>
-        <w:numPr>
-          <w:ilvl w:val="0"/>
-          <w:numId w:val="32"/>
-        </w:numPr>
-        <w:autoSpaceDE/>
-        <w:autoSpaceDN/>
-        <w:spacing w:after="160" w:line="278" w:lineRule="auto"/>
-        <w:contextualSpacing/>
-      </w:pPr>
-      <w:r>
-        <w:t>3 parole volano in parallelo in direzione di dove si trova il nemico</w:t>
-      </w:r>
-    </w:p>
-    <w:p>
-      <w:pPr>
-        <w:pStyle w:val="Paragrafoelenco"/>
-        <w:widowControl/>
-        <w:numPr>
-          <w:ilvl w:val="0"/>
-          <w:numId w:val="32"/>
-        </w:numPr>
-        <w:autoSpaceDE/>
-        <w:autoSpaceDN/>
-        <w:spacing w:after="160" w:line="278" w:lineRule="auto"/>
-        <w:contextualSpacing/>
-      </w:pPr>
-      <w:r>
-        <w:t>7 dmg / parola</w:t>
+        <w:t>Si può rimbalzare sul bordo</w:t>
       </w:r>
     </w:p>
     <w:p>
@@ -4673,780 +4963,7 @@
         <w:contextualSpacing/>
       </w:pPr>
       <w:r>
-        <w:t>Orizzonte dell’ignoto: Ivan crea un buco nero al centro dell’arena che resta 7 secondi</w:t>
-      </w:r>
-    </w:p>
-    <w:p>
-      <w:pPr>
-        <w:pStyle w:val="Paragrafoelenco"/>
-        <w:widowControl/>
-        <w:numPr>
-          <w:ilvl w:val="0"/>
-          <w:numId w:val="32"/>
-        </w:numPr>
-        <w:autoSpaceDE/>
-        <w:autoSpaceDN/>
-        <w:spacing w:after="160" w:line="278" w:lineRule="auto"/>
-        <w:contextualSpacing/>
-      </w:pPr>
-      <w:r>
-        <w:t>Il buco nero attira soltanto i nemici facendo danno con 1.5 di velocità e quando si arriva al centro ci si ferma fino a fine animazione (Sfera che fa danno e aggiunge un vettore di movimento pari a 1.5 in direzione del centro).</w:t>
-      </w:r>
-    </w:p>
-    <w:p>
-      <w:pPr>
-        <w:pStyle w:val="Paragrafoelenco"/>
-        <w:widowControl/>
-        <w:numPr>
-          <w:ilvl w:val="0"/>
-          <w:numId w:val="32"/>
-        </w:numPr>
-        <w:autoSpaceDE/>
-        <w:autoSpaceDN/>
-        <w:spacing w:after="160" w:line="278" w:lineRule="auto"/>
-        <w:contextualSpacing/>
-      </w:pPr>
-      <w:r>
-        <w:t>Più vicino al centro più danno: min: 3/s max: 25/s. Altri danni ignorati</w:t>
-      </w:r>
-    </w:p>
-    <w:p>
-      <w:pPr>
-        <w:widowControl/>
-        <w:autoSpaceDE/>
-        <w:autoSpaceDN/>
-        <w:spacing w:after="160" w:line="278" w:lineRule="auto"/>
-        <w:ind w:left="1416"/>
-        <w:contextualSpacing/>
-      </w:pPr>
-    </w:p>
-    <w:tbl>
-      <w:tblPr>
-        <w:tblStyle w:val="Grigliatabella"/>
-        <w:tblW w:w="9580" w:type="dxa"/>
-        <w:tblInd w:w="284" w:type="dxa"/>
-        <w:tblLook w:val="04A0" w:firstRow="1" w:lastRow="0" w:firstColumn="1" w:lastColumn="0" w:noHBand="0" w:noVBand="1"/>
-      </w:tblPr>
-      <w:tblGrid>
-        <w:gridCol w:w="835"/>
-        <w:gridCol w:w="567"/>
-        <w:gridCol w:w="961"/>
-        <w:gridCol w:w="1087"/>
-        <w:gridCol w:w="2073"/>
-        <w:gridCol w:w="2268"/>
-        <w:gridCol w:w="1789"/>
-      </w:tblGrid>
-      <w:tr>
-        <w:trPr>
-          <w:trHeight w:val="321"/>
-        </w:trPr>
-        <w:tc>
-          <w:tcPr>
-            <w:tcW w:w="835" w:type="dxa"/>
-          </w:tcPr>
-          <w:p>
-            <w:pPr>
-              <w:pStyle w:val="Corpotesto"/>
-              <w:spacing w:before="56"/>
-            </w:pPr>
-            <w:bookmarkStart w:id="0" w:name="_Hlk220669088"/>
-            <w:r>
-              <w:rPr>
-                <w:b/>
-                <w:bCs/>
-              </w:rPr>
-              <w:t>Nome</w:t>
-            </w:r>
-          </w:p>
-        </w:tc>
-        <w:tc>
-          <w:tcPr>
-            <w:tcW w:w="567" w:type="dxa"/>
-          </w:tcPr>
-          <w:p>
-            <w:pPr>
-              <w:pStyle w:val="Corpotesto"/>
-              <w:spacing w:before="56"/>
-              <w:jc w:val="center"/>
-            </w:pPr>
-            <w:r>
-              <w:rPr>
-                <w:b/>
-                <w:bCs/>
-              </w:rPr>
-              <w:t>HP</w:t>
-            </w:r>
-          </w:p>
-        </w:tc>
-        <w:tc>
-          <w:tcPr>
-            <w:tcW w:w="961" w:type="dxa"/>
-          </w:tcPr>
-          <w:p>
-            <w:pPr>
-              <w:pStyle w:val="Corpotesto"/>
-              <w:spacing w:before="56"/>
-              <w:jc w:val="center"/>
-            </w:pPr>
-            <w:r>
-              <w:rPr>
-                <w:b/>
-                <w:bCs/>
-              </w:rPr>
-              <w:t>Velocità</w:t>
-            </w:r>
-          </w:p>
-        </w:tc>
-        <w:tc>
-          <w:tcPr>
-            <w:tcW w:w="1087" w:type="dxa"/>
-            <w:shd w:val="clear" w:color="auto" w:fill="FF0000"/>
-          </w:tcPr>
-          <w:p>
-            <w:pPr>
-              <w:pStyle w:val="Corpotesto"/>
-              <w:spacing w:before="56"/>
-              <w:jc w:val="center"/>
-            </w:pPr>
-            <w:r>
-              <w:rPr>
-                <w:b/>
-                <w:bCs/>
-              </w:rPr>
-              <w:t>Recupero</w:t>
-            </w:r>
-            <w:r>
-              <w:t xml:space="preserve"> </w:t>
-            </w:r>
-            <w:r>
-              <w:rPr>
-                <w:b/>
-                <w:bCs/>
-              </w:rPr>
-              <w:t>Ultimate</w:t>
-            </w:r>
-          </w:p>
-        </w:tc>
-        <w:tc>
-          <w:tcPr>
-            <w:tcW w:w="2073" w:type="dxa"/>
-          </w:tcPr>
-          <w:p>
-            <w:pPr>
-              <w:pStyle w:val="Corpotesto"/>
-              <w:spacing w:before="56"/>
-              <w:jc w:val="center"/>
-            </w:pPr>
-            <w:r>
-              <w:rPr>
-                <w:b/>
-                <w:bCs/>
-              </w:rPr>
-              <w:t>Abilità</w:t>
-            </w:r>
-          </w:p>
-        </w:tc>
-        <w:tc>
-          <w:tcPr>
-            <w:tcW w:w="2268" w:type="dxa"/>
-            <w:shd w:val="clear" w:color="auto" w:fill="FF0000"/>
-          </w:tcPr>
-          <w:p>
-            <w:pPr>
-              <w:pStyle w:val="Corpotesto"/>
-              <w:spacing w:before="56"/>
-              <w:jc w:val="center"/>
-              <w:rPr>
-                <w:b/>
-                <w:bCs/>
-              </w:rPr>
-            </w:pPr>
-            <w:r>
-              <w:rPr>
-                <w:b/>
-                <w:bCs/>
-              </w:rPr>
-              <w:t>Ultimate</w:t>
-            </w:r>
-          </w:p>
-        </w:tc>
-        <w:tc>
-          <w:tcPr>
-            <w:tcW w:w="1789" w:type="dxa"/>
-            <w:shd w:val="clear" w:color="auto" w:fill="FF0000"/>
-          </w:tcPr>
-          <w:p>
-            <w:pPr>
-              <w:pStyle w:val="Corpotesto"/>
-              <w:spacing w:before="56"/>
-              <w:jc w:val="center"/>
-              <w:rPr>
-                <w:b/>
-                <w:bCs/>
-              </w:rPr>
-            </w:pPr>
-            <w:r>
-              <w:rPr>
-                <w:b/>
-                <w:bCs/>
-              </w:rPr>
-              <w:t>Durata</w:t>
-            </w:r>
-          </w:p>
-          <w:p>
-            <w:pPr>
-              <w:pStyle w:val="Corpotesto"/>
-              <w:spacing w:before="56"/>
-              <w:jc w:val="center"/>
-              <w:rPr>
-                <w:b/>
-                <w:bCs/>
-              </w:rPr>
-            </w:pPr>
-            <w:r>
-              <w:rPr>
-                <w:b/>
-                <w:bCs/>
-              </w:rPr>
-              <w:t>Ultimate</w:t>
-            </w:r>
-          </w:p>
-        </w:tc>
-      </w:tr>
-      <w:tr>
-        <w:tc>
-          <w:tcPr>
-            <w:tcW w:w="835" w:type="dxa"/>
-          </w:tcPr>
-          <w:p>
-            <w:pPr>
-              <w:pStyle w:val="Corpotesto"/>
-              <w:spacing w:before="56"/>
-            </w:pPr>
-            <w:r>
-              <w:t>Quan</w:t>
-            </w:r>
-          </w:p>
-        </w:tc>
-        <w:tc>
-          <w:tcPr>
-            <w:tcW w:w="567" w:type="dxa"/>
-          </w:tcPr>
-          <w:p>
-            <w:pPr>
-              <w:pStyle w:val="Corpotesto"/>
-              <w:spacing w:before="56"/>
-              <w:jc w:val="center"/>
-            </w:pPr>
-            <w:r>
-              <w:t>200</w:t>
-            </w:r>
-          </w:p>
-        </w:tc>
-        <w:tc>
-          <w:tcPr>
-            <w:tcW w:w="961" w:type="dxa"/>
-          </w:tcPr>
-          <w:p>
-            <w:pPr>
-              <w:pStyle w:val="Corpotesto"/>
-              <w:spacing w:before="56"/>
-              <w:jc w:val="center"/>
-            </w:pPr>
-            <w:r>
-              <w:t>1.1</w:t>
-            </w:r>
-          </w:p>
-        </w:tc>
-        <w:tc>
-          <w:tcPr>
-            <w:tcW w:w="1087" w:type="dxa"/>
-            <w:shd w:val="clear" w:color="auto" w:fill="FF0000"/>
-          </w:tcPr>
-          <w:p>
-            <w:pPr>
-              <w:pStyle w:val="Corpotesto"/>
-              <w:spacing w:before="56"/>
-              <w:jc w:val="center"/>
-            </w:pPr>
-            <w:r>
-              <w:t>1.1</w:t>
-            </w:r>
-          </w:p>
-        </w:tc>
-        <w:tc>
-          <w:tcPr>
-            <w:tcW w:w="2073" w:type="dxa"/>
-          </w:tcPr>
-          <w:p>
-            <w:pPr>
-              <w:pStyle w:val="Corpotesto"/>
-              <w:spacing w:before="56"/>
-              <w:jc w:val="center"/>
-            </w:pPr>
-            <w:r>
-              <w:t>Ghosting (7s)</w:t>
-            </w:r>
-          </w:p>
-        </w:tc>
-        <w:tc>
-          <w:tcPr>
-            <w:tcW w:w="2268" w:type="dxa"/>
-            <w:shd w:val="clear" w:color="auto" w:fill="FF0000"/>
-          </w:tcPr>
-          <w:p>
-            <w:pPr>
-              <w:pStyle w:val="Corpotesto"/>
-              <w:spacing w:before="56"/>
-              <w:jc w:val="center"/>
-            </w:pPr>
-            <w:r>
-              <w:t>Judgement Cut</w:t>
-            </w:r>
-          </w:p>
-        </w:tc>
-        <w:tc>
-          <w:tcPr>
-            <w:tcW w:w="1789" w:type="dxa"/>
-            <w:shd w:val="clear" w:color="auto" w:fill="FF0000"/>
-          </w:tcPr>
-          <w:p>
-            <w:pPr>
-              <w:pStyle w:val="Corpotesto"/>
-              <w:spacing w:before="56"/>
-              <w:jc w:val="center"/>
-            </w:pPr>
-            <w:r>
-              <w:t>0.1s</w:t>
-            </w:r>
-          </w:p>
-        </w:tc>
-      </w:tr>
-      <w:tr>
-        <w:tc>
-          <w:tcPr>
-            <w:tcW w:w="835" w:type="dxa"/>
-          </w:tcPr>
-          <w:p>
-            <w:pPr>
-              <w:pStyle w:val="Corpotesto"/>
-              <w:spacing w:before="56"/>
-            </w:pPr>
-            <w:r>
-              <w:t>Sidon</w:t>
-            </w:r>
-          </w:p>
-        </w:tc>
-        <w:tc>
-          <w:tcPr>
-            <w:tcW w:w="567" w:type="dxa"/>
-          </w:tcPr>
-          <w:p>
-            <w:pPr>
-              <w:pStyle w:val="Corpotesto"/>
-              <w:spacing w:before="56"/>
-              <w:jc w:val="center"/>
-            </w:pPr>
-            <w:r>
-              <w:t>250</w:t>
-            </w:r>
-          </w:p>
-        </w:tc>
-        <w:tc>
-          <w:tcPr>
-            <w:tcW w:w="961" w:type="dxa"/>
-          </w:tcPr>
-          <w:p>
-            <w:pPr>
-              <w:pStyle w:val="Corpotesto"/>
-              <w:spacing w:before="56"/>
-              <w:jc w:val="center"/>
-            </w:pPr>
-            <w:r>
-              <w:t>1.25</w:t>
-            </w:r>
-          </w:p>
-        </w:tc>
-        <w:tc>
-          <w:tcPr>
-            <w:tcW w:w="1087" w:type="dxa"/>
-            <w:shd w:val="clear" w:color="auto" w:fill="FF0000"/>
-          </w:tcPr>
-          <w:p>
-            <w:pPr>
-              <w:pStyle w:val="Corpotesto"/>
-              <w:spacing w:before="56"/>
-              <w:jc w:val="center"/>
-            </w:pPr>
-            <w:r>
-              <w:t>1</w:t>
-            </w:r>
-          </w:p>
-        </w:tc>
-        <w:tc>
-          <w:tcPr>
-            <w:tcW w:w="2073" w:type="dxa"/>
-          </w:tcPr>
-          <w:p>
-            <w:pPr>
-              <w:pStyle w:val="Corpotesto"/>
-              <w:spacing w:before="56"/>
-              <w:jc w:val="center"/>
-            </w:pPr>
-            <w:r>
-              <w:t>Roberto Carlos (13s)</w:t>
-            </w:r>
-          </w:p>
-        </w:tc>
-        <w:tc>
-          <w:tcPr>
-            <w:tcW w:w="2268" w:type="dxa"/>
-            <w:shd w:val="clear" w:color="auto" w:fill="FF0000"/>
-          </w:tcPr>
-          <w:p>
-            <w:pPr>
-              <w:pStyle w:val="Corpotesto"/>
-              <w:spacing w:before="56"/>
-              <w:jc w:val="center"/>
-            </w:pPr>
-            <w:r>
-              <w:t>10 anni di calcio</w:t>
-            </w:r>
-          </w:p>
-        </w:tc>
-        <w:tc>
-          <w:tcPr>
-            <w:tcW w:w="1789" w:type="dxa"/>
-            <w:shd w:val="clear" w:color="auto" w:fill="FF0000"/>
-          </w:tcPr>
-          <w:p>
-            <w:pPr>
-              <w:pStyle w:val="Corpotesto"/>
-              <w:spacing w:before="56"/>
-              <w:jc w:val="center"/>
-            </w:pPr>
-            <w:r>
-              <w:t>0.5s*8</w:t>
-            </w:r>
-          </w:p>
-        </w:tc>
-      </w:tr>
-      <w:tr>
-        <w:tc>
-          <w:tcPr>
-            <w:tcW w:w="835" w:type="dxa"/>
-          </w:tcPr>
-          <w:p>
-            <w:pPr>
-              <w:pStyle w:val="Corpotesto"/>
-              <w:spacing w:before="56"/>
-            </w:pPr>
-            <w:r>
-              <w:t>Yasser</w:t>
-            </w:r>
-          </w:p>
-        </w:tc>
-        <w:tc>
-          <w:tcPr>
-            <w:tcW w:w="567" w:type="dxa"/>
-          </w:tcPr>
-          <w:p>
-            <w:pPr>
-              <w:pStyle w:val="Corpotesto"/>
-              <w:spacing w:before="56"/>
-              <w:jc w:val="center"/>
-            </w:pPr>
-            <w:r>
-              <w:t>300</w:t>
-            </w:r>
-          </w:p>
-        </w:tc>
-        <w:tc>
-          <w:tcPr>
-            <w:tcW w:w="961" w:type="dxa"/>
-          </w:tcPr>
-          <w:p>
-            <w:pPr>
-              <w:pStyle w:val="Corpotesto"/>
-              <w:spacing w:before="56"/>
-              <w:jc w:val="center"/>
-            </w:pPr>
-            <w:r>
-              <w:t>1</w:t>
-            </w:r>
-          </w:p>
-        </w:tc>
-        <w:tc>
-          <w:tcPr>
-            <w:tcW w:w="1087" w:type="dxa"/>
-            <w:shd w:val="clear" w:color="auto" w:fill="FF0000"/>
-          </w:tcPr>
-          <w:p>
-            <w:pPr>
-              <w:pStyle w:val="Corpotesto"/>
-              <w:spacing w:before="56"/>
-              <w:jc w:val="center"/>
-            </w:pPr>
-            <w:r>
-              <w:t>1</w:t>
-            </w:r>
-          </w:p>
-        </w:tc>
-        <w:tc>
-          <w:tcPr>
-            <w:tcW w:w="2073" w:type="dxa"/>
-          </w:tcPr>
-          <w:p>
-            <w:pPr>
-              <w:pStyle w:val="Corpotesto"/>
-              <w:spacing w:before="56"/>
-              <w:jc w:val="center"/>
-            </w:pPr>
-            <w:r>
-              <w:t>LilBoom(11s)</w:t>
-            </w:r>
-          </w:p>
-        </w:tc>
-        <w:tc>
-          <w:tcPr>
-            <w:tcW w:w="2268" w:type="dxa"/>
-            <w:shd w:val="clear" w:color="auto" w:fill="FF0000"/>
-          </w:tcPr>
-          <w:p>
-            <w:pPr>
-              <w:pStyle w:val="Corpotesto"/>
-              <w:spacing w:before="56"/>
-              <w:jc w:val="center"/>
-              <w:rPr>
-                <w:lang w:val="de-CH"/>
-              </w:rPr>
-            </w:pPr>
-            <w:r>
-              <w:rPr>
-                <w:lang w:val="de-CH"/>
-              </w:rPr>
-              <w:t>Cannonata</w:t>
-            </w:r>
-          </w:p>
-        </w:tc>
-        <w:tc>
-          <w:tcPr>
-            <w:tcW w:w="1789" w:type="dxa"/>
-            <w:shd w:val="clear" w:color="auto" w:fill="FF0000"/>
-          </w:tcPr>
-          <w:p>
-            <w:pPr>
-              <w:pStyle w:val="Corpotesto"/>
-              <w:spacing w:before="56"/>
-              <w:jc w:val="center"/>
-              <w:rPr>
-                <w:lang w:val="de-CH"/>
-              </w:rPr>
-            </w:pPr>
-            <w:r>
-              <w:rPr>
-                <w:lang w:val="de-CH"/>
-              </w:rPr>
-              <w:t>8s</w:t>
-            </w:r>
-          </w:p>
-        </w:tc>
-      </w:tr>
-      <w:tr>
-        <w:tc>
-          <w:tcPr>
-            <w:tcW w:w="835" w:type="dxa"/>
-          </w:tcPr>
-          <w:p>
-            <w:pPr>
-              <w:pStyle w:val="Corpotesto"/>
-              <w:spacing w:before="56"/>
-            </w:pPr>
-            <w:r>
-              <w:t>Ivan</w:t>
-            </w:r>
-          </w:p>
-        </w:tc>
-        <w:tc>
-          <w:tcPr>
-            <w:tcW w:w="567" w:type="dxa"/>
-          </w:tcPr>
-          <w:p>
-            <w:pPr>
-              <w:pStyle w:val="Corpotesto"/>
-              <w:spacing w:before="56"/>
-              <w:jc w:val="center"/>
-            </w:pPr>
-            <w:r>
-              <w:t>250</w:t>
-            </w:r>
-          </w:p>
-        </w:tc>
-        <w:tc>
-          <w:tcPr>
-            <w:tcW w:w="961" w:type="dxa"/>
-          </w:tcPr>
-          <w:p>
-            <w:pPr>
-              <w:pStyle w:val="Corpotesto"/>
-              <w:spacing w:before="56"/>
-              <w:jc w:val="center"/>
-            </w:pPr>
-            <w:r>
-              <w:t>1</w:t>
-            </w:r>
-          </w:p>
-        </w:tc>
-        <w:tc>
-          <w:tcPr>
-            <w:tcW w:w="1087" w:type="dxa"/>
-            <w:shd w:val="clear" w:color="auto" w:fill="FF0000"/>
-          </w:tcPr>
-          <w:p>
-            <w:pPr>
-              <w:pStyle w:val="Corpotesto"/>
-              <w:spacing w:before="56"/>
-              <w:jc w:val="center"/>
-            </w:pPr>
-            <w:r>
-              <w:t>1.2</w:t>
-            </w:r>
-          </w:p>
-        </w:tc>
-        <w:tc>
-          <w:tcPr>
-            <w:tcW w:w="2073" w:type="dxa"/>
-          </w:tcPr>
-          <w:p>
-            <w:pPr>
-              <w:pStyle w:val="Corpotesto"/>
-              <w:spacing w:before="56"/>
-              <w:jc w:val="center"/>
-            </w:pPr>
-            <w:r>
-              <w:t>Pierce Thought (11s)</w:t>
-            </w:r>
-          </w:p>
-        </w:tc>
-        <w:tc>
-          <w:tcPr>
-            <w:tcW w:w="2268" w:type="dxa"/>
-            <w:shd w:val="clear" w:color="auto" w:fill="FF0000"/>
-          </w:tcPr>
-          <w:p>
-            <w:pPr>
-              <w:pStyle w:val="Corpotesto"/>
-              <w:spacing w:before="56"/>
-              <w:jc w:val="center"/>
-            </w:pPr>
-            <w:r>
-              <w:t>Orizzonte dell’ ignoto</w:t>
-            </w:r>
-          </w:p>
-        </w:tc>
-        <w:tc>
-          <w:tcPr>
-            <w:tcW w:w="1789" w:type="dxa"/>
-            <w:shd w:val="clear" w:color="auto" w:fill="FF0000"/>
-          </w:tcPr>
-          <w:p>
-            <w:pPr>
-              <w:pStyle w:val="Corpotesto"/>
-              <w:spacing w:before="56"/>
-              <w:jc w:val="center"/>
-            </w:pPr>
-            <w:r>
-              <w:t>7s</w:t>
-            </w:r>
-          </w:p>
-        </w:tc>
-      </w:tr>
-    </w:tbl>
-    <w:p>
-      <w:pPr>
-        <w:rPr>
-          <w:color w:val="000000" w:themeColor="text1"/>
-        </w:rPr>
-      </w:pPr>
-      <w:r>
-        <w:rPr>
-          <w:color w:val="FF0000"/>
-          <w:shd w:val="clear" w:color="auto" w:fill="FF0000"/>
-        </w:rPr>
-        <w:t>M</w:t>
-      </w:r>
-      <w:r>
-        <w:rPr>
-          <w:color w:val="FF0000"/>
-          <w:shd w:val="clear" w:color="auto" w:fill="FF0000"/>
-        </w:rPr>
-        <w:t xml:space="preserve">  </w:t>
-      </w:r>
-      <w:r>
-        <w:rPr>
-          <w:color w:val="000000" w:themeColor="text1"/>
-        </w:rPr>
-        <w:t>= Facoltativo (Priorità minima)</w:t>
-      </w:r>
-    </w:p>
-    <w:bookmarkEnd w:id="0"/>
-    <w:p>
-      <w:pPr>
-        <w:rPr>
-          <w:color w:val="000000" w:themeColor="text1"/>
-        </w:rPr>
-      </w:pPr>
-    </w:p>
-    <w:p>
-      <w:r>
-        <w:t>La Ultimate si carica così:</w:t>
-      </w:r>
-    </w:p>
-    <w:p>
-      <w:r>
-        <w:t xml:space="preserve">(Danno fatto + danno subito/2 + secondi passati)*coefficiente </w:t>
-      </w:r>
-    </w:p>
-    <w:p>
-      <w:r>
-        <w:t>Bisogna arrivare a 200.</w:t>
-      </w:r>
-    </w:p>
-    <w:p>
-      <w:pPr>
-        <w:rPr>
-          <w:color w:val="000000" w:themeColor="text1"/>
-        </w:rPr>
-      </w:pPr>
-    </w:p>
-    <w:p>
-      <w:pPr>
-        <w:rPr>
-          <w:color w:val="000000" w:themeColor="text1"/>
-        </w:rPr>
-      </w:pPr>
-      <w:r>
-        <w:rPr>
-          <w:color w:val="000000" w:themeColor="text1"/>
-        </w:rPr>
-        <w:t>Knockback presente come un semplice addForce di rigidBody. Viene applicato soltanto dopo un calcio o l’abilità “Roberto Carlos”.</w:t>
-      </w:r>
-    </w:p>
-    <w:p>
-      <w:pPr>
-        <w:rPr>
-          <w:color w:val="000000" w:themeColor="text1"/>
-        </w:rPr>
-      </w:pPr>
-    </w:p>
-    <w:p>
-      <w:pPr>
-        <w:rPr>
-          <w:lang w:val="it-CH"/>
-        </w:rPr>
-      </w:pPr>
-      <w:r>
-        <w:t>Mappe:</w:t>
+        <w:t>Si cade dalle piatteforme e si muore definitivamente</w:t>
       </w:r>
     </w:p>
     <w:p>
@@ -5463,7 +4980,187 @@
         <w:contextualSpacing/>
       </w:pPr>
       <w:r>
-        <w:t>4 Mappe (Tutto resta uguale sono il background cambia):</w:t>
+        <w:t>Non si muovono le piattaforme</w:t>
+      </w:r>
+    </w:p>
+    <w:p>
+      <w:pPr>
+        <w:pStyle w:val="Paragrafoelenco"/>
+        <w:widowControl/>
+        <w:numPr>
+          <w:ilvl w:val="0"/>
+          <w:numId w:val="30"/>
+        </w:numPr>
+        <w:autoSpaceDE/>
+        <w:autoSpaceDN/>
+        <w:spacing w:after="160" w:line="278" w:lineRule="auto"/>
+        <w:contextualSpacing/>
+      </w:pPr>
+      <w:r>
+        <w:t>2 piattaforme sopra i lati della isola principale</w:t>
+      </w:r>
+    </w:p>
+    <w:p>
+      <w:r>
+        <w:t>Numero giocatori: 2</w:t>
+      </w:r>
+    </w:p>
+    <w:p>
+      <w:r>
+        <w:t>Periferiche:</w:t>
+      </w:r>
+    </w:p>
+    <w:p>
+      <w:pPr>
+        <w:pStyle w:val="Paragrafoelenco"/>
+        <w:widowControl/>
+        <w:numPr>
+          <w:ilvl w:val="0"/>
+          <w:numId w:val="30"/>
+        </w:numPr>
+        <w:autoSpaceDE/>
+        <w:autoSpaceDN/>
+        <w:spacing w:after="160" w:line="278" w:lineRule="auto"/>
+        <w:contextualSpacing/>
+      </w:pPr>
+      <w:r>
+        <w:t>Dual sense</w:t>
+      </w:r>
+    </w:p>
+    <w:p>
+      <w:pPr>
+        <w:pStyle w:val="Paragrafoelenco"/>
+        <w:widowControl/>
+        <w:numPr>
+          <w:ilvl w:val="0"/>
+          <w:numId w:val="30"/>
+        </w:numPr>
+        <w:autoSpaceDE/>
+        <w:autoSpaceDN/>
+        <w:spacing w:after="160" w:line="278" w:lineRule="auto"/>
+        <w:contextualSpacing/>
+      </w:pPr>
+      <w:r>
+        <w:t>Xbox pad</w:t>
+      </w:r>
+    </w:p>
+    <w:p>
+      <w:pPr>
+        <w:pStyle w:val="Paragrafoelenco"/>
+        <w:widowControl/>
+        <w:numPr>
+          <w:ilvl w:val="0"/>
+          <w:numId w:val="30"/>
+        </w:numPr>
+        <w:autoSpaceDE/>
+        <w:autoSpaceDN/>
+        <w:spacing w:after="160" w:line="278" w:lineRule="auto"/>
+        <w:contextualSpacing/>
+      </w:pPr>
+      <w:r>
+        <w:t>Tastiera</w:t>
+      </w:r>
+    </w:p>
+    <w:p>
+      <w:r>
+        <w:t>Sviluppo in locale</w:t>
+      </w:r>
+    </w:p>
+    <w:p>
+      <w:r>
+        <w:t>Pubblicazione su server scolastico</w:t>
+      </w:r>
+    </w:p>
+    <w:p>
+      <w:pPr>
+        <w:rPr>
+          <w:lang w:val="de-CH"/>
+        </w:rPr>
+      </w:pPr>
+      <w:r>
+        <w:rPr>
+          <w:lang w:val="de-CH"/>
+        </w:rPr>
+        <w:t>Log erro</w:t>
+      </w:r>
+      <w:r>
+        <w:rPr>
+          <w:lang w:val="de-CH"/>
+        </w:rPr>
+        <w:t>ri</w:t>
+      </w:r>
+    </w:p>
+    <w:p>
+      <w:pPr>
+        <w:rPr>
+          <w:lang w:val="de-CH"/>
+        </w:rPr>
+      </w:pPr>
+      <w:r>
+        <w:rPr>
+          <w:lang w:val="de-CH"/>
+        </w:rPr>
+        <w:t>Grafica pixel art</w:t>
+      </w:r>
+    </w:p>
+    <w:p>
+      <w:pPr>
+        <w:rPr>
+          <w:b/>
+          <w:bCs/>
+        </w:rPr>
+      </w:pPr>
+      <w:r>
+        <w:rPr>
+          <w:b/>
+          <w:bCs/>
+        </w:rPr>
+        <w:lastRenderedPageBreak/>
+        <w:t>SCHERMATE:</w:t>
+      </w:r>
+    </w:p>
+    <w:p>
+      <w:r>
+        <w:t>Schermata principale:</w:t>
+      </w:r>
+    </w:p>
+    <w:p>
+      <w:r>
+        <w:t>Qualsiasi controller o tastiera si può controllare la schermata principale</w:t>
+      </w:r>
+    </w:p>
+    <w:p>
+      <w:pPr>
+        <w:pStyle w:val="Paragrafoelenco"/>
+        <w:widowControl/>
+        <w:numPr>
+          <w:ilvl w:val="0"/>
+          <w:numId w:val="30"/>
+        </w:numPr>
+        <w:autoSpaceDE/>
+        <w:autoSpaceDN/>
+        <w:spacing w:after="160" w:line="278" w:lineRule="auto"/>
+        <w:contextualSpacing/>
+      </w:pPr>
+      <w:r>
+        <w:t>Avvio partita</w:t>
+      </w:r>
+    </w:p>
+    <w:p>
+      <w:pPr>
+        <w:pStyle w:val="Paragrafoelenco"/>
+        <w:widowControl/>
+        <w:numPr>
+          <w:ilvl w:val="0"/>
+          <w:numId w:val="30"/>
+        </w:numPr>
+        <w:autoSpaceDE/>
+        <w:autoSpaceDN/>
+        <w:spacing w:after="160" w:line="278" w:lineRule="auto"/>
+        <w:contextualSpacing/>
+      </w:pPr>
+      <w:r>
+        <w:t>Impostazione</w:t>
       </w:r>
     </w:p>
     <w:p>
@@ -5480,7 +5177,7 @@
         <w:contextualSpacing/>
       </w:pPr>
       <w:r>
-        <w:t>Pincode</w:t>
+        <w:t xml:space="preserve">Volume (Master, SFX, Music) </w:t>
       </w:r>
     </w:p>
     <w:p>
@@ -5497,278 +5194,6 @@
         <w:contextualSpacing/>
       </w:pPr>
       <w:r>
-        <w:t>Bab Al-Hara</w:t>
-      </w:r>
-    </w:p>
-    <w:p>
-      <w:pPr>
-        <w:pStyle w:val="Paragrafoelenco"/>
-        <w:widowControl/>
-        <w:numPr>
-          <w:ilvl w:val="1"/>
-          <w:numId w:val="30"/>
-        </w:numPr>
-        <w:autoSpaceDE/>
-        <w:autoSpaceDN/>
-        <w:spacing w:after="160" w:line="278" w:lineRule="auto"/>
-        <w:contextualSpacing/>
-      </w:pPr>
-      <w:r>
-        <w:t>Xiaohongshu</w:t>
-      </w:r>
-    </w:p>
-    <w:p>
-      <w:pPr>
-        <w:pStyle w:val="Paragrafoelenco"/>
-        <w:widowControl/>
-        <w:numPr>
-          <w:ilvl w:val="1"/>
-          <w:numId w:val="30"/>
-        </w:numPr>
-        <w:autoSpaceDE/>
-        <w:autoSpaceDN/>
-        <w:spacing w:after="160" w:line="278" w:lineRule="auto"/>
-        <w:contextualSpacing/>
-      </w:pPr>
-      <w:r>
-        <w:t>Arebaetaotisetik</w:t>
-      </w:r>
-    </w:p>
-    <w:p>
-      <w:pPr>
-        <w:pStyle w:val="Paragrafoelenco"/>
-        <w:widowControl/>
-        <w:numPr>
-          <w:ilvl w:val="0"/>
-          <w:numId w:val="30"/>
-        </w:numPr>
-        <w:autoSpaceDE/>
-        <w:autoSpaceDN/>
-        <w:spacing w:after="160" w:line="278" w:lineRule="auto"/>
-        <w:contextualSpacing/>
-      </w:pPr>
-      <w:r>
-        <w:t>Si può rimbalzare sul bordo</w:t>
-      </w:r>
-    </w:p>
-    <w:p>
-      <w:pPr>
-        <w:pStyle w:val="Paragrafoelenco"/>
-        <w:widowControl/>
-        <w:numPr>
-          <w:ilvl w:val="0"/>
-          <w:numId w:val="30"/>
-        </w:numPr>
-        <w:autoSpaceDE/>
-        <w:autoSpaceDN/>
-        <w:spacing w:after="160" w:line="278" w:lineRule="auto"/>
-        <w:contextualSpacing/>
-      </w:pPr>
-      <w:r>
-        <w:t>Si cade dalle piatteforme e si muore definitivamente</w:t>
-      </w:r>
-    </w:p>
-    <w:p>
-      <w:pPr>
-        <w:pStyle w:val="Paragrafoelenco"/>
-        <w:widowControl/>
-        <w:numPr>
-          <w:ilvl w:val="0"/>
-          <w:numId w:val="30"/>
-        </w:numPr>
-        <w:autoSpaceDE/>
-        <w:autoSpaceDN/>
-        <w:spacing w:after="160" w:line="278" w:lineRule="auto"/>
-        <w:contextualSpacing/>
-      </w:pPr>
-      <w:r>
-        <w:t>Non si muovono le piattaforme</w:t>
-      </w:r>
-    </w:p>
-    <w:p>
-      <w:pPr>
-        <w:pStyle w:val="Paragrafoelenco"/>
-        <w:widowControl/>
-        <w:numPr>
-          <w:ilvl w:val="0"/>
-          <w:numId w:val="30"/>
-        </w:numPr>
-        <w:autoSpaceDE/>
-        <w:autoSpaceDN/>
-        <w:spacing w:after="160" w:line="278" w:lineRule="auto"/>
-        <w:contextualSpacing/>
-      </w:pPr>
-      <w:r>
-        <w:t>2 piattaforme sopra i lati della isola principale</w:t>
-      </w:r>
-    </w:p>
-    <w:p>
-      <w:r>
-        <w:t xml:space="preserve">Numero giocatori: 2 </w:t>
-      </w:r>
-    </w:p>
-    <w:p>
-      <w:r>
-        <w:t>Periferiche:</w:t>
-      </w:r>
-    </w:p>
-    <w:p>
-      <w:pPr>
-        <w:pStyle w:val="Paragrafoelenco"/>
-        <w:widowControl/>
-        <w:numPr>
-          <w:ilvl w:val="0"/>
-          <w:numId w:val="30"/>
-        </w:numPr>
-        <w:autoSpaceDE/>
-        <w:autoSpaceDN/>
-        <w:spacing w:after="160" w:line="278" w:lineRule="auto"/>
-        <w:contextualSpacing/>
-      </w:pPr>
-      <w:r>
-        <w:t>Dual sense</w:t>
-      </w:r>
-    </w:p>
-    <w:p>
-      <w:pPr>
-        <w:pStyle w:val="Paragrafoelenco"/>
-        <w:widowControl/>
-        <w:numPr>
-          <w:ilvl w:val="0"/>
-          <w:numId w:val="30"/>
-        </w:numPr>
-        <w:autoSpaceDE/>
-        <w:autoSpaceDN/>
-        <w:spacing w:after="160" w:line="278" w:lineRule="auto"/>
-        <w:contextualSpacing/>
-      </w:pPr>
-      <w:r>
-        <w:t>Xbox pad</w:t>
-      </w:r>
-    </w:p>
-    <w:p>
-      <w:pPr>
-        <w:pStyle w:val="Paragrafoelenco"/>
-        <w:widowControl/>
-        <w:numPr>
-          <w:ilvl w:val="0"/>
-          <w:numId w:val="30"/>
-        </w:numPr>
-        <w:autoSpaceDE/>
-        <w:autoSpaceDN/>
-        <w:spacing w:after="160" w:line="278" w:lineRule="auto"/>
-        <w:contextualSpacing/>
-      </w:pPr>
-      <w:r>
-        <w:t>Tastiera</w:t>
-      </w:r>
-    </w:p>
-    <w:p>
-      <w:r>
-        <w:t>Sviluppo in locale.</w:t>
-      </w:r>
-    </w:p>
-    <w:p>
-      <w:r>
-        <w:t>Grafica pixel art</w:t>
-      </w:r>
-    </w:p>
-    <w:p>
-      <w:r>
-        <w:br w:type="page"/>
-      </w:r>
-    </w:p>
-    <w:p>
-      <w:pPr>
-        <w:rPr>
-          <w:b/>
-          <w:bCs/>
-        </w:rPr>
-      </w:pPr>
-      <w:r>
-        <w:rPr>
-          <w:b/>
-          <w:bCs/>
-        </w:rPr>
-        <w:lastRenderedPageBreak/>
-        <w:t>SCHERMATE:</w:t>
-      </w:r>
-    </w:p>
-    <w:p>
-      <w:r>
-        <w:t>Schermata principale:</w:t>
-      </w:r>
-    </w:p>
-    <w:p>
-      <w:r>
-        <w:t>Qualsiasi controller o tastiera si può controllare la schermata principale</w:t>
-      </w:r>
-    </w:p>
-    <w:p>
-      <w:pPr>
-        <w:pStyle w:val="Paragrafoelenco"/>
-        <w:widowControl/>
-        <w:numPr>
-          <w:ilvl w:val="0"/>
-          <w:numId w:val="30"/>
-        </w:numPr>
-        <w:autoSpaceDE/>
-        <w:autoSpaceDN/>
-        <w:spacing w:after="160" w:line="278" w:lineRule="auto"/>
-        <w:contextualSpacing/>
-      </w:pPr>
-      <w:r>
-        <w:t>Avvio partita</w:t>
-      </w:r>
-    </w:p>
-    <w:p>
-      <w:pPr>
-        <w:pStyle w:val="Paragrafoelenco"/>
-        <w:widowControl/>
-        <w:numPr>
-          <w:ilvl w:val="0"/>
-          <w:numId w:val="30"/>
-        </w:numPr>
-        <w:autoSpaceDE/>
-        <w:autoSpaceDN/>
-        <w:spacing w:after="160" w:line="278" w:lineRule="auto"/>
-        <w:contextualSpacing/>
-      </w:pPr>
-      <w:r>
-        <w:t>Impostazione</w:t>
-      </w:r>
-    </w:p>
-    <w:p>
-      <w:pPr>
-        <w:pStyle w:val="Paragrafoelenco"/>
-        <w:widowControl/>
-        <w:numPr>
-          <w:ilvl w:val="1"/>
-          <w:numId w:val="30"/>
-        </w:numPr>
-        <w:autoSpaceDE/>
-        <w:autoSpaceDN/>
-        <w:spacing w:after="160" w:line="278" w:lineRule="auto"/>
-        <w:contextualSpacing/>
-      </w:pPr>
-      <w:r>
-        <w:t xml:space="preserve">Volume (Master, SFX, Music) </w:t>
-      </w:r>
-    </w:p>
-    <w:p>
-      <w:pPr>
-        <w:pStyle w:val="Paragrafoelenco"/>
-        <w:widowControl/>
-        <w:numPr>
-          <w:ilvl w:val="1"/>
-          <w:numId w:val="30"/>
-        </w:numPr>
-        <w:autoSpaceDE/>
-        <w:autoSpaceDN/>
-        <w:spacing w:after="160" w:line="278" w:lineRule="auto"/>
-        <w:contextualSpacing/>
-      </w:pPr>
-      <w:r>
         <w:t>Guida di cosa fanno i diversi tasti</w:t>
       </w:r>
     </w:p>
@@ -5799,7 +5224,7 @@
           <w:noProof/>
         </w:rPr>
         <w:drawing>
-          <wp:inline distT="0" distB="0" distL="0" distR="0" wp14:anchorId="656666CE" wp14:editId="2482DAC2">
+          <wp:inline distT="0" distB="0" distL="0" distR="0" wp14:anchorId="656666CE" wp14:editId="5475F7FF">
             <wp:extent cx="3346138" cy="1793455"/>
             <wp:effectExtent l="0" t="0" r="6985" b="0"/>
             <wp:docPr id="22" name="Immagine 22"/>
@@ -5996,7 +5421,7 @@
           <w:noProof/>
         </w:rPr>
         <w:drawing>
-          <wp:inline distT="0" distB="0" distL="0" distR="0" wp14:anchorId="4B0F09DC" wp14:editId="1AFA1E68">
+          <wp:inline distT="0" distB="0" distL="0" distR="0" wp14:anchorId="4B0F09DC" wp14:editId="2E0DE114">
             <wp:extent cx="2890239" cy="1548342"/>
             <wp:effectExtent l="0" t="0" r="5715" b="0"/>
             <wp:docPr id="23" name="Immagine 23"/>
@@ -6076,7 +5501,7 @@
           <w:noProof/>
         </w:rPr>
         <w:drawing>
-          <wp:inline distT="0" distB="0" distL="0" distR="0" wp14:anchorId="086D3B53" wp14:editId="09253149">
+          <wp:inline distT="0" distB="0" distL="0" distR="0" wp14:anchorId="086D3B53" wp14:editId="7994894B">
             <wp:extent cx="2725387" cy="1460746"/>
             <wp:effectExtent l="0" t="0" r="0" b="6350"/>
             <wp:docPr id="24" name="Immagine 24"/>
@@ -6156,7 +5581,13 @@
         <w:contextualSpacing/>
       </w:pPr>
       <w:r>
-        <w:t>Quando si schiaccia un determinato tasto si va avanti e si inizia il fight</w:t>
+        <w:t>Quando si</w:t>
+      </w:r>
+      <w:r>
+        <w:t xml:space="preserve"> preme</w:t>
+      </w:r>
+      <w:r>
+        <w:t xml:space="preserve"> un determinato tasto si va avanti e si inizia il fight</w:t>
       </w:r>
     </w:p>
     <w:p/>
@@ -6247,19 +5678,36 @@
         <w:contextualSpacing/>
       </w:pPr>
       <w:r>
+        <w:t>Storia sotto foto</w:t>
+      </w:r>
+    </w:p>
+    <w:p>
+      <w:pPr>
+        <w:pStyle w:val="Paragrafoelenco"/>
+        <w:widowControl/>
+        <w:numPr>
+          <w:ilvl w:val="1"/>
+          <w:numId w:val="30"/>
+        </w:numPr>
+        <w:autoSpaceDE/>
+        <w:autoSpaceDN/>
+        <w:spacing w:after="160" w:line="278" w:lineRule="auto"/>
+        <w:contextualSpacing/>
+      </w:pPr>
+      <w:r>
         <w:rPr>
           <w:noProof/>
         </w:rPr>
         <mc:AlternateContent>
           <mc:Choice Requires="wps">
             <w:drawing>
-              <wp:anchor distT="45720" distB="45720" distL="114300" distR="114300" simplePos="0" relativeHeight="487603200" behindDoc="0" locked="0" layoutInCell="1" allowOverlap="1" wp14:anchorId="75F8FA17" wp14:editId="6B9F2888">
+              <wp:anchor distT="45720" distB="45720" distL="114300" distR="114300" simplePos="0" relativeHeight="487603200" behindDoc="0" locked="0" layoutInCell="1" allowOverlap="1" wp14:anchorId="75F8FA17" wp14:editId="5B6C1A36">
                 <wp:simplePos x="0" y="0"/>
                 <wp:positionH relativeFrom="column">
-                  <wp:posOffset>2683510</wp:posOffset>
+                  <wp:posOffset>2677900</wp:posOffset>
                 </wp:positionH>
                 <wp:positionV relativeFrom="paragraph">
-                  <wp:posOffset>276225</wp:posOffset>
+                  <wp:posOffset>245165</wp:posOffset>
                 </wp:positionV>
                 <wp:extent cx="622300" cy="304800"/>
                 <wp:effectExtent l="0" t="0" r="25400" b="19050"/>
@@ -6332,7 +5780,7 @@
                 <v:stroke joinstyle="miter"/>
                 <v:path gradientshapeok="t" o:connecttype="rect"/>
               </v:shapetype>
-              <v:shape id="Casella di testo 19" o:spid="_x0000_s1026" type="#_x0000_t202" style="position:absolute;left:0;text-align:left;margin-left:211.3pt;margin-top:21.75pt;width:49pt;height:24pt;z-index:487603200;visibility:visible;mso-wrap-style:square;mso-width-percent:0;mso-height-percent:0;mso-wrap-distance-left:9pt;mso-wrap-distance-top:3.6pt;mso-wrap-distance-right:9pt;mso-wrap-distance-bottom:3.6pt;mso-position-horizontal:absolute;mso-position-horizontal-relative:text;mso-position-vertical:absolute;mso-position-vertical-relative:text;mso-width-percent:0;mso-height-percent:0;mso-width-relative:margin;mso-height-relative:margin;v-text-anchor:top" o:gfxdata="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">
+              <v:shape id="Casella di testo 19" o:spid="_x0000_s1026" type="#_x0000_t202" style="position:absolute;left:0;text-align:left;margin-left:210.85pt;margin-top:19.3pt;width:49pt;height:24pt;z-index:487603200;visibility:visible;mso-wrap-style:square;mso-width-percent:0;mso-height-percent:0;mso-wrap-distance-left:9pt;mso-wrap-distance-top:3.6pt;mso-wrap-distance-right:9pt;mso-wrap-distance-bottom:3.6pt;mso-position-horizontal:absolute;mso-position-horizontal-relative:text;mso-position-vertical:absolute;mso-position-vertical-relative:text;mso-width-percent:0;mso-height-percent:0;mso-width-relative:margin;mso-height-relative:margin;v-text-anchor:top" o:gfxdata="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">
                 <v:textbox>
                   <w:txbxContent>
                     <w:p>
@@ -6356,17 +5804,22 @@
         </mc:AlternateContent>
       </w:r>
       <w:r>
+        <w:t>Numero partite vinte</w:t>
+      </w:r>
+    </w:p>
+    <w:p>
+      <w:r>
         <w:rPr>
           <w:noProof/>
         </w:rPr>
         <w:drawing>
-          <wp:anchor distT="0" distB="0" distL="114300" distR="114300" simplePos="0" relativeHeight="487600128" behindDoc="1" locked="0" layoutInCell="1" allowOverlap="1" wp14:anchorId="53E2E410" wp14:editId="425420FD">
+          <wp:anchor distT="0" distB="0" distL="114300" distR="114300" simplePos="0" relativeHeight="487600128" behindDoc="1" locked="0" layoutInCell="1" allowOverlap="1" wp14:anchorId="53E2E410" wp14:editId="69C158C1">
             <wp:simplePos x="0" y="0"/>
-            <wp:positionH relativeFrom="column">
-              <wp:posOffset>-1270</wp:posOffset>
+            <wp:positionH relativeFrom="margin">
+              <wp:align>left</wp:align>
             </wp:positionH>
             <wp:positionV relativeFrom="paragraph">
-              <wp:posOffset>314325</wp:posOffset>
+              <wp:posOffset>2540</wp:posOffset>
             </wp:positionV>
             <wp:extent cx="3501390" cy="1719580"/>
             <wp:effectExtent l="0" t="0" r="3810" b="0"/>
@@ -6412,18 +5865,13 @@
         </w:drawing>
       </w:r>
       <w:r>
-        <w:t>Storia sotto foto</w:t>
-      </w:r>
-    </w:p>
-    <w:p>
-      <w:r>
         <w:rPr>
           <w:noProof/>
         </w:rPr>
         <mc:AlternateContent>
           <mc:Choice Requires="wps">
             <w:drawing>
-              <wp:anchor distT="45720" distB="45720" distL="114300" distR="114300" simplePos="0" relativeHeight="487602176" behindDoc="0" locked="0" layoutInCell="1" allowOverlap="1" wp14:anchorId="30826852" wp14:editId="15E8E689">
+              <wp:anchor distT="45720" distB="45720" distL="114300" distR="114300" simplePos="0" relativeHeight="487602176" behindDoc="0" locked="0" layoutInCell="1" allowOverlap="1" wp14:anchorId="30826852" wp14:editId="3ED69A21">
                 <wp:simplePos x="0" y="0"/>
                 <wp:positionH relativeFrom="column">
                   <wp:posOffset>461010</wp:posOffset>
@@ -6738,7 +6186,147 @@
         </mc:AlternateContent>
       </w:r>
     </w:p>
-    <w:p/>
+    <w:p>
+      <w:r>
+        <w:rPr>
+          <w:noProof/>
+        </w:rPr>
+        <mc:AlternateContent>
+          <mc:Choice Requires="wps">
+            <w:drawing>
+              <wp:anchor distT="45720" distB="45720" distL="114300" distR="114300" simplePos="0" relativeHeight="487605248" behindDoc="0" locked="0" layoutInCell="1" allowOverlap="1" wp14:anchorId="4CA2C14C" wp14:editId="30151550">
+                <wp:simplePos x="0" y="0"/>
+                <wp:positionH relativeFrom="column">
+                  <wp:posOffset>1828878</wp:posOffset>
+                </wp:positionH>
+                <wp:positionV relativeFrom="paragraph">
+                  <wp:posOffset>81401</wp:posOffset>
+                </wp:positionV>
+                <wp:extent cx="1672590" cy="1404620"/>
+                <wp:effectExtent l="0" t="0" r="22860" b="12700"/>
+                <wp:wrapNone/>
+                <wp:docPr id="28" name="Casella di testo 2"/>
+                <wp:cNvGraphicFramePr>
+                  <a:graphicFrameLocks xmlns:a="http://schemas.openxmlformats.org/drawingml/2006/main"/>
+                </wp:cNvGraphicFramePr>
+                <a:graphic xmlns:a="http://schemas.openxmlformats.org/drawingml/2006/main">
+                  <a:graphicData uri="http://schemas.microsoft.com/office/word/2010/wordprocessingShape">
+                    <wps:wsp>
+                      <wps:cNvSpPr txBox="1">
+                        <a:spLocks noChangeArrowheads="1"/>
+                      </wps:cNvSpPr>
+                      <wps:spPr bwMode="auto">
+                        <a:xfrm>
+                          <a:off x="0" y="0"/>
+                          <a:ext cx="1672590" cy="1404620"/>
+                        </a:xfrm>
+                        <a:prstGeom prst="rect">
+                          <a:avLst/>
+                        </a:prstGeom>
+                        <a:solidFill>
+                          <a:srgbClr val="FFFFFF"/>
+                        </a:solidFill>
+                        <a:ln w="9525">
+                          <a:solidFill>
+                            <a:srgbClr val="000000"/>
+                          </a:solidFill>
+                          <a:miter lim="800000"/>
+                          <a:headEnd/>
+                          <a:tailEnd/>
+                        </a:ln>
+                      </wps:spPr>
+                      <wps:txbx>
+                        <w:txbxContent>
+                          <w:p>
+                            <w:pPr>
+                              <w:rPr>
+                                <w:sz w:val="10"/>
+                                <w:szCs w:val="10"/>
+                              </w:rPr>
+                            </w:pPr>
+                            <w:r>
+                              <w:rPr>
+                                <w:sz w:val="10"/>
+                                <w:szCs w:val="10"/>
+                              </w:rPr>
+                              <w:t>Partite vinte : XX</w:t>
+                            </w:r>
+                            <w:r>
+                              <w:rPr>
+                                <w:sz w:val="10"/>
+                                <w:szCs w:val="10"/>
+                              </w:rPr>
+                              <w:t xml:space="preserve"> | partite giocate: XX | percentale XX%</w:t>
+                            </w:r>
+                          </w:p>
+                        </w:txbxContent>
+                      </wps:txbx>
+                      <wps:bodyPr rot="0" vert="horz" wrap="square" lIns="91440" tIns="45720" rIns="91440" bIns="45720" anchor="t" anchorCtr="0">
+                        <a:spAutoFit/>
+                      </wps:bodyPr>
+                    </wps:wsp>
+                  </a:graphicData>
+                </a:graphic>
+                <wp14:sizeRelH relativeFrom="margin">
+                  <wp14:pctWidth>0</wp14:pctWidth>
+                </wp14:sizeRelH>
+                <wp14:sizeRelV relativeFrom="margin">
+                  <wp14:pctHeight>20000</wp14:pctHeight>
+                </wp14:sizeRelV>
+              </wp:anchor>
+            </w:drawing>
+          </mc:Choice>
+          <mc:Fallback>
+            <w:pict>
+              <v:shape w14:anchorId="4CA2C14C" id="_x0000_s1030" type="#_x0000_t202" style="position:absolute;margin-left:2in;margin-top:6.4pt;width:131.7pt;height:110.6pt;z-index:487605248;visibility:visible;mso-wrap-style:square;mso-width-percent:0;mso-height-percent:200;mso-wrap-distance-left:9pt;mso-wrap-distance-top:3.6pt;mso-wrap-distance-right:9pt;mso-wrap-distance-bottom:3.6pt;mso-position-horizontal:absolute;mso-position-horizontal-relative:text;mso-position-vertical:absolute;mso-position-vertical-relative:text;mso-width-percent:0;mso-height-percent:200;mso-width-relative:margin;mso-height-relative:margin;v-text-anchor:top" o:gfxdata="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">
+                <v:textbox style="mso-fit-shape-to-text:t">
+                  <w:txbxContent>
+                    <w:p>
+                      <w:pPr>
+                        <w:rPr>
+                          <w:sz w:val="10"/>
+                          <w:szCs w:val="10"/>
+                        </w:rPr>
+                      </w:pPr>
+                      <w:r>
+                        <w:rPr>
+                          <w:sz w:val="10"/>
+                          <w:szCs w:val="10"/>
+                        </w:rPr>
+                        <w:t>Partite vinte : XX</w:t>
+                      </w:r>
+                      <w:r>
+                        <w:rPr>
+                          <w:sz w:val="10"/>
+                          <w:szCs w:val="10"/>
+                        </w:rPr>
+                        <w:t xml:space="preserve"> | partite giocate: XX | </w:t>
+                      </w:r>
+                      <w:proofErr w:type="spellStart"/>
+                      <w:r>
+                        <w:rPr>
+                          <w:sz w:val="10"/>
+                          <w:szCs w:val="10"/>
+                        </w:rPr>
+                        <w:t>percentale</w:t>
+                      </w:r>
+                      <w:proofErr w:type="spellEnd"/>
+                      <w:r>
+                        <w:rPr>
+                          <w:sz w:val="10"/>
+                          <w:szCs w:val="10"/>
+                        </w:rPr>
+                        <w:t xml:space="preserve"> XX%</w:t>
+                      </w:r>
+                    </w:p>
+                  </w:txbxContent>
+                </v:textbox>
+              </v:shape>
+            </w:pict>
+          </mc:Fallback>
+        </mc:AlternateContent>
+      </w:r>
+    </w:p>
     <w:p/>
     <w:p/>
     <w:p/>
@@ -6879,7 +6467,127 @@
           <w:noProof/>
         </w:rPr>
         <w:drawing>
-          <wp:inline distT="0" distB="0" distL="0" distR="0" wp14:anchorId="004C8F6C" wp14:editId="3C72549F">
+          <wp:anchor distT="0" distB="0" distL="114300" distR="114300" simplePos="0" relativeHeight="487606272" behindDoc="0" locked="0" layoutInCell="1" allowOverlap="1" wp14:anchorId="0072902A" wp14:editId="6F6B7E53">
+            <wp:simplePos x="0" y="0"/>
+            <wp:positionH relativeFrom="column">
+              <wp:posOffset>2288540</wp:posOffset>
+            </wp:positionH>
+            <wp:positionV relativeFrom="paragraph">
+              <wp:posOffset>303000</wp:posOffset>
+            </wp:positionV>
+            <wp:extent cx="723265" cy="402489"/>
+            <wp:effectExtent l="0" t="0" r="635" b="0"/>
+            <wp:wrapNone/>
+            <wp:docPr id="29" name="Immagine 29"/>
+            <wp:cNvGraphicFramePr>
+              <a:graphicFrameLocks xmlns:a="http://schemas.openxmlformats.org/drawingml/2006/main" noChangeAspect="1"/>
+            </wp:cNvGraphicFramePr>
+            <a:graphic xmlns:a="http://schemas.openxmlformats.org/drawingml/2006/main">
+              <a:graphicData uri="http://schemas.openxmlformats.org/drawingml/2006/picture">
+                <pic:pic xmlns:pic="http://schemas.openxmlformats.org/drawingml/2006/picture">
+                  <pic:nvPicPr>
+                    <pic:cNvPr id="1" name=""/>
+                    <pic:cNvPicPr/>
+                  </pic:nvPicPr>
+                  <pic:blipFill>
+                    <a:blip r:embed="rId15">
+                      <a:extLst>
+                        <a:ext uri="{28A0092B-C50C-407E-A947-70E740481C1C}">
+                          <a14:useLocalDpi xmlns:a14="http://schemas.microsoft.com/office/drawing/2010/main" val="0"/>
+                        </a:ext>
+                      </a:extLst>
+                    </a:blip>
+                    <a:stretch>
+                      <a:fillRect/>
+                    </a:stretch>
+                  </pic:blipFill>
+                  <pic:spPr>
+                    <a:xfrm>
+                      <a:off x="0" y="0"/>
+                      <a:ext cx="723265" cy="402489"/>
+                    </a:xfrm>
+                    <a:prstGeom prst="rect">
+                      <a:avLst/>
+                    </a:prstGeom>
+                  </pic:spPr>
+                </pic:pic>
+              </a:graphicData>
+            </a:graphic>
+            <wp14:sizeRelH relativeFrom="margin">
+              <wp14:pctWidth>0</wp14:pctWidth>
+            </wp14:sizeRelH>
+            <wp14:sizeRelV relativeFrom="margin">
+              <wp14:pctHeight>0</wp14:pctHeight>
+            </wp14:sizeRelV>
+          </wp:anchor>
+        </w:drawing>
+      </w:r>
+      <w:r>
+        <w:rPr>
+          <w:noProof/>
+        </w:rPr>
+        <w:drawing>
+          <wp:anchor distT="0" distB="0" distL="114300" distR="114300" simplePos="0" relativeHeight="487608320" behindDoc="0" locked="0" layoutInCell="1" allowOverlap="1" wp14:anchorId="481C2D87" wp14:editId="02AA7863">
+            <wp:simplePos x="0" y="0"/>
+            <wp:positionH relativeFrom="margin">
+              <wp:align>left</wp:align>
+            </wp:positionH>
+            <wp:positionV relativeFrom="paragraph">
+              <wp:posOffset>354529</wp:posOffset>
+            </wp:positionV>
+            <wp:extent cx="802204" cy="363653"/>
+            <wp:effectExtent l="0" t="0" r="0" b="0"/>
+            <wp:wrapNone/>
+            <wp:docPr id="30" name="Immagine 30"/>
+            <wp:cNvGraphicFramePr>
+              <a:graphicFrameLocks xmlns:a="http://schemas.openxmlformats.org/drawingml/2006/main" noChangeAspect="1"/>
+            </wp:cNvGraphicFramePr>
+            <a:graphic xmlns:a="http://schemas.openxmlformats.org/drawingml/2006/main">
+              <a:graphicData uri="http://schemas.openxmlformats.org/drawingml/2006/picture">
+                <pic:pic xmlns:pic="http://schemas.openxmlformats.org/drawingml/2006/picture">
+                  <pic:nvPicPr>
+                    <pic:cNvPr id="1" name=""/>
+                    <pic:cNvPicPr/>
+                  </pic:nvPicPr>
+                  <pic:blipFill>
+                    <a:blip r:embed="rId15">
+                      <a:extLst>
+                        <a:ext uri="{28A0092B-C50C-407E-A947-70E740481C1C}">
+                          <a14:useLocalDpi xmlns:a14="http://schemas.microsoft.com/office/drawing/2010/main" val="0"/>
+                        </a:ext>
+                      </a:extLst>
+                    </a:blip>
+                    <a:stretch>
+                      <a:fillRect/>
+                    </a:stretch>
+                  </pic:blipFill>
+                  <pic:spPr>
+                    <a:xfrm>
+                      <a:off x="0" y="0"/>
+                      <a:ext cx="804565" cy="364723"/>
+                    </a:xfrm>
+                    <a:prstGeom prst="rect">
+                      <a:avLst/>
+                    </a:prstGeom>
+                  </pic:spPr>
+                </pic:pic>
+              </a:graphicData>
+            </a:graphic>
+            <wp14:sizeRelH relativeFrom="margin">
+              <wp14:pctWidth>0</wp14:pctWidth>
+            </wp14:sizeRelH>
+            <wp14:sizeRelV relativeFrom="margin">
+              <wp14:pctHeight>0</wp14:pctHeight>
+            </wp14:sizeRelV>
+          </wp:anchor>
+        </w:drawing>
+      </w:r>
+      <w:r>
+        <w:rPr>
+          <w:noProof/>
+        </w:rPr>
+        <w:drawing>
+          <wp:inline distT="0" distB="0" distL="0" distR="0" wp14:anchorId="004C8F6C" wp14:editId="709AB166">
             <wp:extent cx="3003550" cy="1703082"/>
             <wp:effectExtent l="0" t="0" r="6350" b="0"/>
             <wp:docPr id="26" name="Immagine 26"/>
@@ -6896,7 +6604,7 @@
                     </pic:cNvPicPr>
                   </pic:nvPicPr>
                   <pic:blipFill>
-                    <a:blip r:embed="rId15" cstate="print">
+                    <a:blip r:embed="rId16" cstate="print">
                       <a:extLst>
                         <a:ext uri="{28A0092B-C50C-407E-A947-70E740481C1C}">
                           <a14:useLocalDpi xmlns:a14="http://schemas.microsoft.com/office/drawing/2010/main" val="0"/>
@@ -6983,7 +6691,7 @@
                     </pic:cNvPicPr>
                   </pic:nvPicPr>
                   <pic:blipFill rotWithShape="1">
-                    <a:blip r:embed="rId16">
+                    <a:blip r:embed="rId17">
                       <a:extLst>
                         <a:ext uri="{28A0092B-C50C-407E-A947-70E740481C1C}">
                           <a14:useLocalDpi xmlns:a14="http://schemas.microsoft.com/office/drawing/2010/main" val="0"/>
@@ -7018,6 +6726,7 @@
         </w:drawing>
       </w:r>
     </w:p>
+    <w:p/>
     <w:p/>
     <w:p>
       <w:pPr>
@@ -7638,7 +7347,7 @@
               </wp:anchor>
             </w:drawing>
           </mc:Choice>
-          <mc:Fallback xmlns:w16du="http://schemas.microsoft.com/office/word/2023/wordml/word16du" xmlns:w16sdtfl="http://schemas.microsoft.com/office/word/2024/wordml/sdtformatlock">
+          <mc:Fallback xmlns:w16sdtfl="http://schemas.microsoft.com/office/word/2024/wordml/sdtformatlock" xmlns:w16du="http://schemas.microsoft.com/office/word/2023/wordml/word16du">
             <w:pict>
               <v:rect w14:anchorId="2A0A7705" id="docshape13" o:spid="_x0000_s1026" style="position:absolute;margin-left:55.2pt;margin-top:18.2pt;width:484.9pt;height:.5pt;z-index:-15725568;visibility:visible;mso-wrap-style:square;mso-width-percent:0;mso-height-percent:0;mso-wrap-distance-left:0;mso-wrap-distance-top:0;mso-wrap-distance-right:0;mso-wrap-distance-bottom:0;mso-position-horizontal:absolute;mso-position-horizontal-relative:page;mso-position-vertical:absolute;mso-position-vertical-relative:text;mso-width-percent:0;mso-height-percent:0;mso-width-relative:page;mso-height-relative:page;v-text-anchor:top" o:gfxdata="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" fillcolor="black" stroked="f">
                 <w10:wrap type="topAndBottom" anchorx="page"/>
@@ -8080,7 +7789,7 @@
               </wp:anchor>
             </w:drawing>
           </mc:Choice>
-          <mc:Fallback xmlns:w16du="http://schemas.microsoft.com/office/word/2023/wordml/word16du" xmlns:w16sdtfl="http://schemas.microsoft.com/office/word/2024/wordml/sdtformatlock">
+          <mc:Fallback xmlns:w16sdtfl="http://schemas.microsoft.com/office/word/2024/wordml/sdtformatlock" xmlns:w16du="http://schemas.microsoft.com/office/word/2023/wordml/word16du">
             <w:pict>
               <v:rect w14:anchorId="2FFC1467" id="docshape14" o:spid="_x0000_s1026" style="position:absolute;margin-left:55.2pt;margin-top:18.2pt;width:484.9pt;height:.5pt;z-index:-15725056;visibility:visible;mso-wrap-style:square;mso-width-percent:0;mso-height-percent:0;mso-wrap-distance-left:0;mso-wrap-distance-top:0;mso-wrap-distance-right:0;mso-wrap-distance-bottom:0;mso-position-horizontal:absolute;mso-position-horizontal-relative:page;mso-position-vertical:absolute;mso-position-vertical-relative:text;mso-width-percent:0;mso-height-percent:0;mso-width-relative:page;mso-height-relative:page;v-text-anchor:top" o:gfxdata="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" fillcolor="black" stroked="f">
                 <w10:wrap type="topAndBottom" anchorx="page"/>
@@ -8151,6 +7860,124 @@
     </w:p>
     <w:p>
       <w:pPr>
+        <w:pStyle w:val="NormaleWeb"/>
+        <w:spacing w:after="0"/>
+        <w:ind w:left="170"/>
+        <w:jc w:val="both"/>
+        <w:rPr>
+          <w:rFonts w:asciiTheme="minorHAnsi" w:hAnsiTheme="minorHAnsi" w:cstheme="minorHAnsi"/>
+          <w:sz w:val="22"/>
+          <w:szCs w:val="22"/>
+          <w:lang w:val="it-IT"/>
+        </w:rPr>
+      </w:pPr>
+      <w:bookmarkStart w:id="1" w:name="OLE_LINK14"/>
+      <w:bookmarkStart w:id="2" w:name="OLE_LINK15"/>
+      <w:r>
+        <w:rPr>
+          <w:rFonts w:asciiTheme="minorHAnsi" w:hAnsiTheme="minorHAnsi" w:cstheme="minorHAnsi"/>
+          <w:sz w:val="22"/>
+          <w:szCs w:val="22"/>
+          <w:lang w:val="it-IT"/>
+        </w:rPr>
+        <w:t xml:space="preserve">La griglia di valutazione definisce i criteri generali secondo cui il lavoro </w:t>
+      </w:r>
+      <w:r>
+        <w:rPr>
+          <w:rFonts w:asciiTheme="minorHAnsi" w:hAnsiTheme="minorHAnsi" w:cstheme="minorHAnsi"/>
+          <w:sz w:val="22"/>
+          <w:szCs w:val="22"/>
+          <w:lang w:val="it-IT"/>
+        </w:rPr>
+        <w:t>dell’allievo</w:t>
+      </w:r>
+      <w:r>
+        <w:rPr>
+          <w:rFonts w:asciiTheme="minorHAnsi" w:hAnsiTheme="minorHAnsi" w:cstheme="minorHAnsi"/>
+          <w:sz w:val="22"/>
+          <w:szCs w:val="22"/>
+          <w:lang w:val="it-IT"/>
+        </w:rPr>
+        <w:t xml:space="preserve"> sarà valutato (documentazione, diario, rispetto de</w:t>
+      </w:r>
+      <w:r>
+        <w:rPr>
+          <w:rFonts w:asciiTheme="minorHAnsi" w:hAnsiTheme="minorHAnsi" w:cstheme="minorHAnsi"/>
+          <w:sz w:val="22"/>
+          <w:szCs w:val="22"/>
+          <w:lang w:val="it-IT"/>
+        </w:rPr>
+        <w:t>gli</w:t>
+      </w:r>
+      <w:r>
+        <w:rPr>
+          <w:rFonts w:asciiTheme="minorHAnsi" w:hAnsiTheme="minorHAnsi" w:cstheme="minorHAnsi"/>
+          <w:sz w:val="22"/>
+          <w:szCs w:val="22"/>
+          <w:lang w:val="it-IT"/>
+        </w:rPr>
+        <w:t xml:space="preserve"> standard, </w:t>
+      </w:r>
+      <w:r>
+        <w:rPr>
+          <w:rFonts w:asciiTheme="minorHAnsi" w:hAnsiTheme="minorHAnsi" w:cstheme="minorHAnsi"/>
+          <w:sz w:val="22"/>
+          <w:szCs w:val="22"/>
+          <w:lang w:val="it-IT"/>
+        </w:rPr>
+        <w:t xml:space="preserve">della </w:t>
+      </w:r>
+      <w:r>
+        <w:rPr>
+          <w:rFonts w:asciiTheme="minorHAnsi" w:hAnsiTheme="minorHAnsi" w:cstheme="minorHAnsi"/>
+          <w:sz w:val="22"/>
+          <w:szCs w:val="22"/>
+          <w:lang w:val="it-IT"/>
+        </w:rPr>
+        <w:t>qualità, ...).</w:t>
+      </w:r>
+    </w:p>
+    <w:p>
+      <w:pPr>
+        <w:pStyle w:val="NormaleWeb"/>
+        <w:spacing w:before="0" w:beforeAutospacing="0" w:after="0"/>
+        <w:ind w:left="170"/>
+        <w:jc w:val="both"/>
+        <w:rPr>
+          <w:rFonts w:asciiTheme="minorHAnsi" w:hAnsiTheme="minorHAnsi" w:cstheme="minorHAnsi"/>
+          <w:sz w:val="10"/>
+          <w:szCs w:val="10"/>
+          <w:lang w:val="it-IT"/>
+        </w:rPr>
+      </w:pPr>
+    </w:p>
+    <w:bookmarkEnd w:id="1"/>
+    <w:bookmarkEnd w:id="2"/>
+    <w:p>
+      <w:pPr>
+        <w:pStyle w:val="NormaleWeb"/>
+        <w:spacing w:before="0" w:beforeAutospacing="0" w:after="0"/>
+        <w:ind w:left="170"/>
+        <w:jc w:val="both"/>
+        <w:rPr>
+          <w:rFonts w:asciiTheme="minorHAnsi" w:hAnsiTheme="minorHAnsi" w:cstheme="minorHAnsi"/>
+          <w:sz w:val="22"/>
+          <w:szCs w:val="22"/>
+          <w:lang w:val="it-IT"/>
+        </w:rPr>
+      </w:pPr>
+      <w:r>
+        <w:rPr>
+          <w:rFonts w:asciiTheme="minorHAnsi" w:hAnsiTheme="minorHAnsi" w:cstheme="minorHAnsi"/>
+          <w:sz w:val="22"/>
+          <w:szCs w:val="22"/>
+          <w:lang w:val="it-IT"/>
+        </w:rPr>
+        <w:t>Inoltre, il lavoro sarà valutato sui seguenti 7 punti specifici (punti da A14 a A20):</w:t>
+      </w:r>
+    </w:p>
+    <w:p>
+      <w:pPr>
         <w:pStyle w:val="western"/>
         <w:spacing w:before="0" w:beforeAutospacing="0" w:after="0"/>
         <w:rPr>
@@ -8162,12 +7989,8 @@
     <w:p>
       <w:pPr>
         <w:pStyle w:val="western"/>
-        <w:numPr>
-          <w:ilvl w:val="0"/>
-          <w:numId w:val="4"/>
-        </w:numPr>
         <w:spacing w:before="0" w:beforeAutospacing="0" w:after="0"/>
-        <w:ind w:left="567"/>
+        <w:ind w:left="207"/>
         <w:rPr>
           <w:rFonts w:asciiTheme="minorHAnsi" w:hAnsiTheme="minorHAnsi" w:cstheme="minorHAnsi"/>
           <w:lang w:val="it-IT"/>
@@ -8180,7 +8003,7 @@
           <w:bCs/>
           <w:lang w:val="it-IT"/>
         </w:rPr>
-        <w:t>Tema 228</w:t>
+        <w:t>228</w:t>
       </w:r>
       <w:r>
         <w:rPr>
@@ -8194,21 +8017,17 @@
           <w:rFonts w:asciiTheme="minorHAnsi" w:hAnsiTheme="minorHAnsi" w:cstheme="minorHAnsi"/>
           <w:lang w:val="it-CH"/>
         </w:rPr>
-        <w:t>Il manuale utente è completo, corretto e comprensibile?</w:t>
+        <w:t>Manuale utente</w:t>
       </w:r>
     </w:p>
     <w:p>
       <w:pPr>
         <w:pStyle w:val="western"/>
-        <w:numPr>
-          <w:ilvl w:val="0"/>
-          <w:numId w:val="4"/>
-        </w:numPr>
         <w:spacing w:before="0" w:beforeAutospacing="0" w:after="0"/>
-        <w:ind w:left="567"/>
+        <w:ind w:left="207"/>
         <w:rPr>
           <w:rFonts w:asciiTheme="minorHAnsi" w:hAnsiTheme="minorHAnsi" w:cstheme="minorHAnsi"/>
-          <w:lang w:val="it-IT"/>
+          <w:lang w:val="it-CH"/>
         </w:rPr>
       </w:pPr>
       <w:r>
@@ -8216,55 +8035,101 @@
           <w:rFonts w:asciiTheme="minorHAnsi" w:hAnsiTheme="minorHAnsi" w:cstheme="minorHAnsi"/>
           <w:b/>
           <w:bCs/>
-          <w:lang w:val="it-IT"/>
-        </w:rPr>
-        <w:t>Te</w:t>
-      </w:r>
+          <w:lang w:val="it-CH"/>
+        </w:rPr>
+        <w:t>148</w:t>
+      </w:r>
+      <w:r>
+        <w:rPr>
+          <w:rFonts w:asciiTheme="minorHAnsi" w:hAnsiTheme="minorHAnsi" w:cstheme="minorHAnsi"/>
+          <w:lang w:val="it-CH"/>
+        </w:rPr>
+        <w:t>:</w:t>
+      </w:r>
+      <w:r>
+        <w:rPr>
+          <w:rFonts w:asciiTheme="minorHAnsi" w:hAnsiTheme="minorHAnsi" w:cstheme="minorHAnsi"/>
+          <w:lang w:val="it-CH"/>
+        </w:rPr>
+        <w:t xml:space="preserve"> Solidità, verifica dei dati, intercettazione degli errori di inserimento</w:t>
+      </w:r>
+    </w:p>
+    <w:p>
+      <w:pPr>
+        <w:pStyle w:val="western"/>
+        <w:spacing w:before="0" w:beforeAutospacing="0" w:after="0"/>
+        <w:ind w:left="207"/>
+        <w:rPr>
+          <w:rFonts w:asciiTheme="minorHAnsi" w:hAnsiTheme="minorHAnsi" w:cstheme="minorHAnsi"/>
+          <w:lang w:val="it-CH"/>
+        </w:rPr>
+      </w:pPr>
       <w:r>
         <w:rPr>
           <w:rFonts w:asciiTheme="minorHAnsi" w:hAnsiTheme="minorHAnsi" w:cstheme="minorHAnsi"/>
           <w:b/>
           <w:bCs/>
-          <w:lang w:val="it-IT"/>
-        </w:rPr>
-        <w:t>ma</w:t>
-      </w:r>
+          <w:lang w:val="it-CH"/>
+        </w:rPr>
+        <w:t>140</w:t>
+      </w:r>
+      <w:r>
+        <w:rPr>
+          <w:rFonts w:asciiTheme="minorHAnsi" w:hAnsiTheme="minorHAnsi" w:cstheme="minorHAnsi"/>
+          <w:lang w:val="it-CH"/>
+        </w:rPr>
+        <w:t>:</w:t>
+      </w:r>
+      <w:r>
+        <w:rPr>
+          <w:rFonts w:asciiTheme="minorHAnsi" w:hAnsiTheme="minorHAnsi" w:cstheme="minorHAnsi"/>
+          <w:lang w:val="it-CH"/>
+        </w:rPr>
+        <w:t xml:space="preserve"> Documentazione (Workflow – Application)</w:t>
+      </w:r>
+    </w:p>
+    <w:p>
+      <w:pPr>
+        <w:pStyle w:val="western"/>
+        <w:spacing w:before="0" w:beforeAutospacing="0" w:after="0"/>
+        <w:ind w:left="207"/>
+        <w:rPr>
+          <w:rFonts w:asciiTheme="minorHAnsi" w:hAnsiTheme="minorHAnsi" w:cstheme="minorHAnsi"/>
+          <w:lang w:val="it-CH"/>
+        </w:rPr>
+      </w:pPr>
       <w:r>
         <w:rPr>
           <w:rFonts w:asciiTheme="minorHAnsi" w:hAnsiTheme="minorHAnsi" w:cstheme="minorHAnsi"/>
           <w:b/>
           <w:bCs/>
-          <w:lang w:val="it-IT"/>
-        </w:rPr>
-        <w:t xml:space="preserve"> 241</w:t>
-      </w:r>
-      <w:r>
-        <w:rPr>
-          <w:rFonts w:asciiTheme="minorHAnsi" w:hAnsiTheme="minorHAnsi" w:cstheme="minorHAnsi"/>
-          <w:lang w:val="it-IT"/>
-        </w:rPr>
-        <w:t xml:space="preserve">: </w:t>
+          <w:lang w:val="it-CH"/>
+        </w:rPr>
+        <w:t>166</w:t>
       </w:r>
       <w:r>
         <w:rPr>
           <w:rFonts w:asciiTheme="minorHAnsi" w:hAnsiTheme="minorHAnsi" w:cstheme="minorHAnsi"/>
           <w:lang w:val="it-CH"/>
         </w:rPr>
-        <w:t>Lo studio di fattibilità è stato pienamente realizzato?</w:t>
+        <w:t>:</w:t>
+      </w:r>
+      <w:r>
+        <w:rPr>
+          <w:rFonts w:asciiTheme="minorHAnsi" w:hAnsiTheme="minorHAnsi" w:cstheme="minorHAnsi"/>
+          <w:lang w:val="it-CH"/>
+        </w:rPr>
+        <w:t xml:space="preserve"> Stile di codifica; Leggibilità del codice</w:t>
       </w:r>
     </w:p>
     <w:p>
       <w:pPr>
         <w:pStyle w:val="western"/>
-        <w:numPr>
-          <w:ilvl w:val="0"/>
-          <w:numId w:val="4"/>
-        </w:numPr>
         <w:spacing w:before="0" w:beforeAutospacing="0" w:after="0"/>
-        <w:ind w:left="567"/>
+        <w:ind w:left="207"/>
         <w:rPr>
           <w:rFonts w:asciiTheme="minorHAnsi" w:hAnsiTheme="minorHAnsi" w:cstheme="minorHAnsi"/>
-          <w:lang w:val="it-IT"/>
+          <w:lang w:val="it-CH"/>
         </w:rPr>
       </w:pPr>
       <w:r>
@@ -8272,51 +8137,33 @@
           <w:rFonts w:asciiTheme="minorHAnsi" w:hAnsiTheme="minorHAnsi" w:cstheme="minorHAnsi"/>
           <w:b/>
           <w:bCs/>
-          <w:lang w:val="it-IT"/>
-        </w:rPr>
-        <w:t>Tema 161</w:t>
+          <w:lang w:val="it-CH"/>
+        </w:rPr>
+        <w:t>164</w:t>
       </w:r>
       <w:r>
         <w:rPr>
           <w:rFonts w:asciiTheme="minorHAnsi" w:hAnsiTheme="minorHAnsi" w:cstheme="minorHAnsi"/>
-          <w:lang w:val="it-IT"/>
-        </w:rPr>
-        <w:t xml:space="preserve">: </w:t>
+          <w:lang w:val="it-CH"/>
+        </w:rPr>
+        <w:t>:</w:t>
       </w:r>
       <w:r>
         <w:rPr>
           <w:rFonts w:asciiTheme="minorHAnsi" w:hAnsiTheme="minorHAnsi" w:cstheme="minorHAnsi"/>
-          <w:lang w:val="it-IT"/>
-        </w:rPr>
-        <w:t>Il o la candidato/a può presentare un concetto del sistema che rappresenti in</w:t>
-      </w:r>
-      <w:r>
+          <w:lang w:val="it-CH"/>
+        </w:rPr>
+        <w:t xml:space="preserve"> Codifica: Gestione degli errori</w:t>
+      </w:r>
+    </w:p>
+    <w:p>
+      <w:pPr>
+        <w:pStyle w:val="western"/>
+        <w:spacing w:before="0" w:beforeAutospacing="0" w:after="0"/>
+        <w:ind w:left="207"/>
         <w:rPr>
           <w:rFonts w:asciiTheme="minorHAnsi" w:hAnsiTheme="minorHAnsi" w:cstheme="minorHAnsi"/>
-          <w:lang w:val="it-IT"/>
-        </w:rPr>
-        <w:t xml:space="preserve"> </w:t>
-      </w:r>
-      <w:r>
-        <w:rPr>
-          <w:rFonts w:asciiTheme="minorHAnsi" w:hAnsiTheme="minorHAnsi" w:cstheme="minorHAnsi"/>
-          <w:lang w:val="it-IT"/>
-        </w:rPr>
-        <w:t>modo adeguato/chiaro il problema?</w:t>
-      </w:r>
-    </w:p>
-    <w:p>
-      <w:pPr>
-        <w:pStyle w:val="western"/>
-        <w:numPr>
-          <w:ilvl w:val="0"/>
-          <w:numId w:val="4"/>
-        </w:numPr>
-        <w:spacing w:before="0" w:beforeAutospacing="0" w:after="0"/>
-        <w:ind w:left="567"/>
-        <w:rPr>
-          <w:rFonts w:asciiTheme="minorHAnsi" w:hAnsiTheme="minorHAnsi" w:cstheme="minorHAnsi"/>
-          <w:lang w:val="it-IT"/>
+          <w:lang w:val="it-CH"/>
         </w:rPr>
       </w:pPr>
       <w:r>
@@ -8324,37 +8171,33 @@
           <w:rFonts w:asciiTheme="minorHAnsi" w:hAnsiTheme="minorHAnsi" w:cstheme="minorHAnsi"/>
           <w:b/>
           <w:bCs/>
-          <w:lang w:val="it-IT"/>
-        </w:rPr>
-        <w:t>Tema 165</w:t>
-      </w:r>
-      <w:r>
-        <w:rPr>
-          <w:rFonts w:asciiTheme="minorHAnsi" w:hAnsiTheme="minorHAnsi" w:cstheme="minorHAnsi"/>
-          <w:lang w:val="it-IT"/>
-        </w:rPr>
-        <w:t xml:space="preserve">: </w:t>
+          <w:lang w:val="it-CH"/>
+        </w:rPr>
+        <w:t>224</w:t>
       </w:r>
       <w:r>
         <w:rPr>
           <w:rFonts w:asciiTheme="minorHAnsi" w:hAnsiTheme="minorHAnsi" w:cstheme="minorHAnsi"/>
           <w:lang w:val="it-CH"/>
         </w:rPr>
-        <w:t>Il candidato è in grado d’implementare le soluzioni proposte?</w:t>
+        <w:t>:</w:t>
+      </w:r>
+      <w:r>
+        <w:rPr>
+          <w:rFonts w:asciiTheme="minorHAnsi" w:hAnsiTheme="minorHAnsi" w:cstheme="minorHAnsi"/>
+          <w:lang w:val="it-CH"/>
+        </w:rPr>
+        <w:t xml:space="preserve"> Registro eventi/Logging (automatico o manuale)</w:t>
       </w:r>
     </w:p>
     <w:p>
       <w:pPr>
         <w:pStyle w:val="western"/>
-        <w:numPr>
-          <w:ilvl w:val="0"/>
-          <w:numId w:val="4"/>
-        </w:numPr>
         <w:spacing w:before="0" w:beforeAutospacing="0" w:after="0"/>
-        <w:ind w:left="567"/>
+        <w:ind w:left="207"/>
         <w:rPr>
           <w:rFonts w:asciiTheme="minorHAnsi" w:hAnsiTheme="minorHAnsi" w:cstheme="minorHAnsi"/>
-          <w:lang w:val="it-IT"/>
+          <w:lang w:val="it-CH"/>
         </w:rPr>
       </w:pPr>
       <w:r>
@@ -8362,106 +8205,23 @@
           <w:rFonts w:asciiTheme="minorHAnsi" w:hAnsiTheme="minorHAnsi" w:cstheme="minorHAnsi"/>
           <w:b/>
           <w:bCs/>
-          <w:lang w:val="it-IT"/>
-        </w:rPr>
-        <w:t>Tema 123</w:t>
-      </w:r>
-      <w:r>
-        <w:rPr>
-          <w:rFonts w:asciiTheme="minorHAnsi" w:hAnsiTheme="minorHAnsi" w:cstheme="minorHAnsi"/>
-          <w:lang w:val="it-IT"/>
-        </w:rPr>
-        <w:t xml:space="preserve">: </w:t>
+          <w:lang w:val="it-CH"/>
+        </w:rPr>
+        <w:t>227</w:t>
       </w:r>
       <w:r>
         <w:rPr>
           <w:rFonts w:asciiTheme="minorHAnsi" w:hAnsiTheme="minorHAnsi" w:cstheme="minorHAnsi"/>
           <w:lang w:val="it-CH"/>
         </w:rPr>
-        <w:t>Il codice sorgente dell’applicazione è stato sufficientemente commentato?</w:t>
-      </w:r>
-    </w:p>
-    <w:p>
-      <w:pPr>
-        <w:pStyle w:val="western"/>
-        <w:numPr>
-          <w:ilvl w:val="0"/>
-          <w:numId w:val="4"/>
-        </w:numPr>
-        <w:spacing w:before="0" w:beforeAutospacing="0" w:after="0"/>
-        <w:ind w:left="567"/>
+        <w:t>:</w:t>
+      </w:r>
+      <w:r>
         <w:rPr>
           <w:rFonts w:asciiTheme="minorHAnsi" w:hAnsiTheme="minorHAnsi" w:cstheme="minorHAnsi"/>
-          <w:lang w:val="it-IT"/>
-        </w:rPr>
-      </w:pPr>
-      <w:r>
-        <w:rPr>
-          <w:rFonts w:asciiTheme="minorHAnsi" w:hAnsiTheme="minorHAnsi" w:cstheme="minorHAnsi"/>
-          <w:b/>
-          <w:bCs/>
-          <w:lang w:val="it-IT"/>
-        </w:rPr>
-        <w:t>Tema 121</w:t>
-      </w:r>
-      <w:r>
-        <w:rPr>
-          <w:rFonts w:asciiTheme="minorHAnsi" w:hAnsiTheme="minorHAnsi" w:cstheme="minorHAnsi"/>
-          <w:lang w:val="it-IT"/>
-        </w:rPr>
-        <w:t>: L'applicazione è facile da usare (user-friendly)? L'ergonomia richiesta dall'utente</w:t>
-      </w:r>
-      <w:r>
-        <w:rPr>
-          <w:rFonts w:asciiTheme="minorHAnsi" w:hAnsiTheme="minorHAnsi" w:cstheme="minorHAnsi"/>
-          <w:lang w:val="it-IT"/>
-        </w:rPr>
-        <w:t xml:space="preserve"> </w:t>
-      </w:r>
-      <w:r>
-        <w:rPr>
-          <w:rFonts w:asciiTheme="minorHAnsi" w:hAnsiTheme="minorHAnsi" w:cstheme="minorHAnsi"/>
-          <w:lang w:val="it-IT"/>
-        </w:rPr>
-        <w:t>è implementata?</w:t>
-      </w:r>
-    </w:p>
-    <w:p>
-      <w:pPr>
-        <w:pStyle w:val="western"/>
-        <w:numPr>
-          <w:ilvl w:val="0"/>
-          <w:numId w:val="4"/>
-        </w:numPr>
-        <w:spacing w:before="0" w:beforeAutospacing="0" w:after="0"/>
-        <w:ind w:left="567"/>
-        <w:rPr>
-          <w:rFonts w:asciiTheme="minorHAnsi" w:hAnsiTheme="minorHAnsi" w:cstheme="minorHAnsi"/>
-          <w:lang w:val="it-IT"/>
-        </w:rPr>
-      </w:pPr>
-      <w:r>
-        <w:rPr>
-          <w:rFonts w:asciiTheme="minorHAnsi" w:hAnsiTheme="minorHAnsi" w:cstheme="minorHAnsi"/>
-          <w:b/>
-          <w:bCs/>
-          <w:lang w:val="it-IT"/>
-        </w:rPr>
-        <w:t>Tema 236</w:t>
-      </w:r>
-      <w:r>
-        <w:rPr>
-          <w:rFonts w:asciiTheme="minorHAnsi" w:hAnsiTheme="minorHAnsi" w:cstheme="minorHAnsi"/>
-          <w:lang w:val="it-IT"/>
-        </w:rPr>
-        <w:t xml:space="preserve">: </w:t>
-      </w:r>
-      <w:r>
-        <w:rPr>
-          <w:rFonts w:asciiTheme="minorHAnsi" w:hAnsiTheme="minorHAnsi" w:cstheme="minorHAnsi"/>
-          <w:lang w:val="it-IT"/>
-        </w:rPr>
-        <w:t>Gestione degli errori: gli eventuali errori sono identificati e gestiti tramite i mezzi adeguati?</w:t>
+          <w:lang w:val="it-CH"/>
+        </w:rPr>
+        <w:t xml:space="preserve"> Rispetto degli standard</w:t>
       </w:r>
     </w:p>
     <w:p>
@@ -8562,7 +8322,7 @@
               </wp:inline>
             </w:drawing>
           </mc:Choice>
-          <mc:Fallback xmlns:w16du="http://schemas.microsoft.com/office/word/2023/wordml/word16du" xmlns:w16sdtfl="http://schemas.microsoft.com/office/word/2024/wordml/sdtformatlock">
+          <mc:Fallback xmlns:w16sdtfl="http://schemas.microsoft.com/office/word/2024/wordml/sdtformatlock" xmlns:w16du="http://schemas.microsoft.com/office/word/2023/wordml/word16du">
             <w:pict>
               <v:group w14:anchorId="02693557" id="docshapegroup15" o:spid="_x0000_s1026" style="width:484.95pt;height:.5pt;mso-position-horizontal-relative:char;mso-position-vertical-relative:line" coordsize="9699,10" o:gfxdata="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">
                 <v:rect id="docshape16" o:spid="_x0000_s1027" style="position:absolute;width:9699;height:10;visibility:visible;mso-wrap-style:square;v-text-anchor:top" o:gfxdata="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" fillcolor="black" stroked="f"/>
@@ -8693,27 +8453,6 @@
               </w:rPr>
               <w:t>Canobbio,</w:t>
             </w:r>
-            <w:r>
-              <w:rPr>
-                <w:spacing w:val="-6"/>
-                <w:sz w:val="16"/>
-              </w:rPr>
-              <w:t xml:space="preserve"> </w:t>
-            </w:r>
-            <w:r>
-              <w:rPr>
-                <w:spacing w:val="-2"/>
-                <w:sz w:val="16"/>
-              </w:rPr>
-              <w:t>30.08.202</w:t>
-            </w:r>
-            <w:r>
-              <w:rPr>
-                <w:spacing w:val="-2"/>
-                <w:sz w:val="16"/>
-              </w:rPr>
-              <w:t>3</w:t>
-            </w:r>
           </w:p>
         </w:tc>
         <w:tc>
@@ -8734,27 +8473,6 @@
                 <w:sz w:val="16"/>
               </w:rPr>
               <w:t>Canobbio,</w:t>
-            </w:r>
-            <w:r>
-              <w:rPr>
-                <w:spacing w:val="-5"/>
-                <w:sz w:val="16"/>
-              </w:rPr>
-              <w:t xml:space="preserve"> </w:t>
-            </w:r>
-            <w:r>
-              <w:rPr>
-                <w:spacing w:val="-2"/>
-                <w:sz w:val="16"/>
-              </w:rPr>
-              <w:t>30.08.202</w:t>
-            </w:r>
-            <w:r>
-              <w:rPr>
-                <w:spacing w:val="-2"/>
-                <w:sz w:val="16"/>
-              </w:rPr>
-              <w:t>3</w:t>
             </w:r>
           </w:p>
         </w:tc>
@@ -8866,7 +8584,7 @@
               </wp:anchor>
             </w:drawing>
           </mc:Choice>
-          <mc:Fallback xmlns:w16du="http://schemas.microsoft.com/office/word/2023/wordml/word16du" xmlns:w16sdtfl="http://schemas.microsoft.com/office/word/2024/wordml/sdtformatlock">
+          <mc:Fallback xmlns:w16sdtfl="http://schemas.microsoft.com/office/word/2024/wordml/sdtformatlock" xmlns:w16du="http://schemas.microsoft.com/office/word/2023/wordml/word16du">
             <w:pict>
               <v:rect w14:anchorId="1F8C973B" id="docshape17" o:spid="_x0000_s1026" style="position:absolute;margin-left:223.25pt;margin-top:12.4pt;width:122.65pt;height:.95pt;z-index:-15724032;visibility:visible;mso-wrap-style:square;mso-width-percent:0;mso-height-percent:0;mso-wrap-distance-left:0;mso-wrap-distance-top:0;mso-wrap-distance-right:0;mso-wrap-distance-bottom:0;mso-position-horizontal:absolute;mso-position-horizontal-relative:page;mso-position-vertical:absolute;mso-position-vertical-relative:text;mso-width-percent:0;mso-height-percent:0;mso-width-relative:page;mso-height-relative:page;v-text-anchor:top" o:gfxdata="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" fillcolor="black" stroked="f">
                 <w10:wrap type="topAndBottom" anchorx="page"/>
@@ -8945,7 +8663,7 @@
               </wp:anchor>
             </w:drawing>
           </mc:Choice>
-          <mc:Fallback xmlns:w16du="http://schemas.microsoft.com/office/word/2023/wordml/word16du" xmlns:w16sdtfl="http://schemas.microsoft.com/office/word/2024/wordml/sdtformatlock">
+          <mc:Fallback xmlns:w16sdtfl="http://schemas.microsoft.com/office/word/2024/wordml/sdtformatlock" xmlns:w16du="http://schemas.microsoft.com/office/word/2023/wordml/word16du">
             <w:pict>
               <v:rect w14:anchorId="5C3318E3" id="docshape18" o:spid="_x0000_s1026" style="position:absolute;margin-left:390.55pt;margin-top:12.4pt;width:122.55pt;height:.95pt;z-index:-15723520;visibility:visible;mso-wrap-style:square;mso-width-percent:0;mso-height-percent:0;mso-wrap-distance-left:0;mso-wrap-distance-top:0;mso-wrap-distance-right:0;mso-wrap-distance-bottom:0;mso-position-horizontal:absolute;mso-position-horizontal-relative:page;mso-position-vertical:absolute;mso-position-vertical-relative:text;mso-width-percent:0;mso-height-percent:0;mso-width-relative:page;mso-height-relative:page;v-text-anchor:top" o:gfxdata="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" fillcolor="black" stroked="f">
                 <w10:wrap type="topAndBottom" anchorx="page"/>
@@ -13034,6 +12752,118 @@
     </w:lvl>
   </w:abstractNum>
   <w:abstractNum w:abstractNumId="22" w15:restartNumberingAfterBreak="0">
+    <w:nsid w:val="4EFC588C"/>
+    <w:multiLevelType w:val="hybridMultilevel"/>
+    <w:tmpl w:val="7D220AFC"/>
+    <w:lvl w:ilvl="0" w:tplc="A3F6A40A">
+      <w:numFmt w:val="bullet"/>
+      <w:lvlText w:val="-"/>
+      <w:lvlJc w:val="left"/>
+      <w:pPr>
+        <w:ind w:left="1080" w:hanging="360"/>
+      </w:pPr>
+      <w:rPr>
+        <w:rFonts w:ascii="Calibri" w:eastAsia="Calibri" w:hAnsi="Calibri" w:cs="Calibri" w:hint="default"/>
+      </w:rPr>
+    </w:lvl>
+    <w:lvl w:ilvl="1" w:tplc="08100003" w:tentative="1">
+      <w:start w:val="1"/>
+      <w:numFmt w:val="bullet"/>
+      <w:lvlText w:val="o"/>
+      <w:lvlJc w:val="left"/>
+      <w:pPr>
+        <w:ind w:left="1800" w:hanging="360"/>
+      </w:pPr>
+      <w:rPr>
+        <w:rFonts w:ascii="Courier New" w:hAnsi="Courier New" w:cs="Courier New" w:hint="default"/>
+      </w:rPr>
+    </w:lvl>
+    <w:lvl w:ilvl="2" w:tplc="08100005" w:tentative="1">
+      <w:start w:val="1"/>
+      <w:numFmt w:val="bullet"/>
+      <w:lvlText w:val=""/>
+      <w:lvlJc w:val="left"/>
+      <w:pPr>
+        <w:ind w:left="2520" w:hanging="360"/>
+      </w:pPr>
+      <w:rPr>
+        <w:rFonts w:ascii="Wingdings" w:hAnsi="Wingdings" w:hint="default"/>
+      </w:rPr>
+    </w:lvl>
+    <w:lvl w:ilvl="3" w:tplc="08100001" w:tentative="1">
+      <w:start w:val="1"/>
+      <w:numFmt w:val="bullet"/>
+      <w:lvlText w:val=""/>
+      <w:lvlJc w:val="left"/>
+      <w:pPr>
+        <w:ind w:left="3240" w:hanging="360"/>
+      </w:pPr>
+      <w:rPr>
+        <w:rFonts w:ascii="Symbol" w:hAnsi="Symbol" w:hint="default"/>
+      </w:rPr>
+    </w:lvl>
+    <w:lvl w:ilvl="4" w:tplc="08100003" w:tentative="1">
+      <w:start w:val="1"/>
+      <w:numFmt w:val="bullet"/>
+      <w:lvlText w:val="o"/>
+      <w:lvlJc w:val="left"/>
+      <w:pPr>
+        <w:ind w:left="3960" w:hanging="360"/>
+      </w:pPr>
+      <w:rPr>
+        <w:rFonts w:ascii="Courier New" w:hAnsi="Courier New" w:cs="Courier New" w:hint="default"/>
+      </w:rPr>
+    </w:lvl>
+    <w:lvl w:ilvl="5" w:tplc="08100005" w:tentative="1">
+      <w:start w:val="1"/>
+      <w:numFmt w:val="bullet"/>
+      <w:lvlText w:val=""/>
+      <w:lvlJc w:val="left"/>
+      <w:pPr>
+        <w:ind w:left="4680" w:hanging="360"/>
+      </w:pPr>
+      <w:rPr>
+        <w:rFonts w:ascii="Wingdings" w:hAnsi="Wingdings" w:hint="default"/>
+      </w:rPr>
+    </w:lvl>
+    <w:lvl w:ilvl="6" w:tplc="08100001" w:tentative="1">
+      <w:start w:val="1"/>
+      <w:numFmt w:val="bullet"/>
+      <w:lvlText w:val=""/>
+      <w:lvlJc w:val="left"/>
+      <w:pPr>
+        <w:ind w:left="5400" w:hanging="360"/>
+      </w:pPr>
+      <w:rPr>
+        <w:rFonts w:ascii="Symbol" w:hAnsi="Symbol" w:hint="default"/>
+      </w:rPr>
+    </w:lvl>
+    <w:lvl w:ilvl="7" w:tplc="08100003" w:tentative="1">
+      <w:start w:val="1"/>
+      <w:numFmt w:val="bullet"/>
+      <w:lvlText w:val="o"/>
+      <w:lvlJc w:val="left"/>
+      <w:pPr>
+        <w:ind w:left="6120" w:hanging="360"/>
+      </w:pPr>
+      <w:rPr>
+        <w:rFonts w:ascii="Courier New" w:hAnsi="Courier New" w:cs="Courier New" w:hint="default"/>
+      </w:rPr>
+    </w:lvl>
+    <w:lvl w:ilvl="8" w:tplc="08100005" w:tentative="1">
+      <w:start w:val="1"/>
+      <w:numFmt w:val="bullet"/>
+      <w:lvlText w:val=""/>
+      <w:lvlJc w:val="left"/>
+      <w:pPr>
+        <w:ind w:left="6840" w:hanging="360"/>
+      </w:pPr>
+      <w:rPr>
+        <w:rFonts w:ascii="Wingdings" w:hAnsi="Wingdings" w:hint="default"/>
+      </w:rPr>
+    </w:lvl>
+  </w:abstractNum>
+  <w:abstractNum w:abstractNumId="23" w15:restartNumberingAfterBreak="0">
     <w:nsid w:val="51B84F67"/>
     <w:multiLevelType w:val="multilevel"/>
     <w:tmpl w:val="DA7A1AA4"/>
@@ -13182,7 +13012,7 @@
       </w:rPr>
     </w:lvl>
   </w:abstractNum>
-  <w:abstractNum w:abstractNumId="23" w15:restartNumberingAfterBreak="0">
+  <w:abstractNum w:abstractNumId="24" w15:restartNumberingAfterBreak="0">
     <w:nsid w:val="520F474E"/>
     <w:multiLevelType w:val="hybridMultilevel"/>
     <w:tmpl w:val="19CAE2D2"/>
@@ -13295,7 +13125,7 @@
       </w:rPr>
     </w:lvl>
   </w:abstractNum>
-  <w:abstractNum w:abstractNumId="24" w15:restartNumberingAfterBreak="0">
+  <w:abstractNum w:abstractNumId="25" w15:restartNumberingAfterBreak="0">
     <w:nsid w:val="67E63CB6"/>
     <w:multiLevelType w:val="multilevel"/>
     <w:tmpl w:val="C4A44BB4"/>
@@ -13444,7 +13274,7 @@
       </w:rPr>
     </w:lvl>
   </w:abstractNum>
-  <w:abstractNum w:abstractNumId="25" w15:restartNumberingAfterBreak="0">
+  <w:abstractNum w:abstractNumId="26" w15:restartNumberingAfterBreak="0">
     <w:nsid w:val="6D342B26"/>
     <w:multiLevelType w:val="hybridMultilevel"/>
     <w:tmpl w:val="2F80BE7A"/>
@@ -13557,7 +13387,7 @@
       </w:rPr>
     </w:lvl>
   </w:abstractNum>
-  <w:abstractNum w:abstractNumId="26" w15:restartNumberingAfterBreak="0">
+  <w:abstractNum w:abstractNumId="27" w15:restartNumberingAfterBreak="0">
     <w:nsid w:val="6F7F2FC7"/>
     <w:multiLevelType w:val="multilevel"/>
     <w:tmpl w:val="1FA66836"/>
@@ -13706,7 +13536,7 @@
       </w:rPr>
     </w:lvl>
   </w:abstractNum>
-  <w:abstractNum w:abstractNumId="27" w15:restartNumberingAfterBreak="0">
+  <w:abstractNum w:abstractNumId="28" w15:restartNumberingAfterBreak="0">
     <w:nsid w:val="702346F9"/>
     <w:multiLevelType w:val="multilevel"/>
     <w:tmpl w:val="F15846B8"/>
@@ -13819,7 +13649,7 @@
       </w:pPr>
     </w:lvl>
   </w:abstractNum>
-  <w:abstractNum w:abstractNumId="28" w15:restartNumberingAfterBreak="0">
+  <w:abstractNum w:abstractNumId="29" w15:restartNumberingAfterBreak="0">
     <w:nsid w:val="71947A0D"/>
     <w:multiLevelType w:val="hybridMultilevel"/>
     <w:tmpl w:val="84320908"/>
@@ -13931,7 +13761,7 @@
       </w:rPr>
     </w:lvl>
   </w:abstractNum>
-  <w:abstractNum w:abstractNumId="29" w15:restartNumberingAfterBreak="0">
+  <w:abstractNum w:abstractNumId="30" w15:restartNumberingAfterBreak="0">
     <w:nsid w:val="762822FB"/>
     <w:multiLevelType w:val="hybridMultilevel"/>
     <w:tmpl w:val="51D26138"/>
@@ -14074,7 +13904,7 @@
       </w:rPr>
     </w:lvl>
   </w:abstractNum>
-  <w:abstractNum w:abstractNumId="30" w15:restartNumberingAfterBreak="0">
+  <w:abstractNum w:abstractNumId="31" w15:restartNumberingAfterBreak="0">
     <w:nsid w:val="765C6DE2"/>
     <w:multiLevelType w:val="hybridMultilevel"/>
     <w:tmpl w:val="8DB01C42"/>
@@ -14194,7 +14024,7 @@
       </w:rPr>
     </w:lvl>
   </w:abstractNum>
-  <w:abstractNum w:abstractNumId="31" w15:restartNumberingAfterBreak="0">
+  <w:abstractNum w:abstractNumId="32" w15:restartNumberingAfterBreak="0">
     <w:nsid w:val="76E876B0"/>
     <w:multiLevelType w:val="hybridMultilevel"/>
     <w:tmpl w:val="FB4E82B4"/>
@@ -14281,16 +14111,16 @@
     </w:lvl>
   </w:abstractNum>
   <w:num w:numId="1" w16cid:durableId="1555895699">
-    <w:abstractNumId w:val="30"/>
+    <w:abstractNumId w:val="31"/>
   </w:num>
   <w:num w:numId="2" w16cid:durableId="610670598">
-    <w:abstractNumId w:val="29"/>
+    <w:abstractNumId w:val="30"/>
   </w:num>
   <w:num w:numId="3" w16cid:durableId="1441683803">
     <w:abstractNumId w:val="0"/>
   </w:num>
   <w:num w:numId="4" w16cid:durableId="925187516">
-    <w:abstractNumId w:val="27"/>
+    <w:abstractNumId w:val="28"/>
     <w:lvlOverride w:ilvl="0">
       <w:startOverride w:val="1"/>
     </w:lvlOverride>
@@ -14323,7 +14153,7 @@
     <w:abstractNumId w:val="17"/>
   </w:num>
   <w:num w:numId="6" w16cid:durableId="1197962449">
-    <w:abstractNumId w:val="31"/>
+    <w:abstractNumId w:val="32"/>
   </w:num>
   <w:num w:numId="7" w16cid:durableId="334502130">
     <w:abstractNumId w:val="7"/>
@@ -14335,7 +14165,7 @@
     <w:abstractNumId w:val="13"/>
   </w:num>
   <w:num w:numId="10" w16cid:durableId="1446339735">
-    <w:abstractNumId w:val="28"/>
+    <w:abstractNumId w:val="29"/>
   </w:num>
   <w:num w:numId="11" w16cid:durableId="871261300">
     <w:abstractNumId w:val="11"/>
@@ -14350,13 +14180,13 @@
     <w:abstractNumId w:val="4"/>
   </w:num>
   <w:num w:numId="15" w16cid:durableId="1643998979">
-    <w:abstractNumId w:val="24"/>
+    <w:abstractNumId w:val="25"/>
   </w:num>
   <w:num w:numId="16" w16cid:durableId="1652320454">
     <w:abstractNumId w:val="9"/>
   </w:num>
   <w:num w:numId="17" w16cid:durableId="759104294">
-    <w:abstractNumId w:val="22"/>
+    <w:abstractNumId w:val="23"/>
   </w:num>
   <w:num w:numId="18" w16cid:durableId="1963655271">
     <w:abstractNumId w:val="1"/>
@@ -14383,13 +14213,13 @@
     <w:abstractNumId w:val="19"/>
   </w:num>
   <w:num w:numId="26" w16cid:durableId="607125658">
-    <w:abstractNumId w:val="26"/>
+    <w:abstractNumId w:val="27"/>
   </w:num>
   <w:num w:numId="27" w16cid:durableId="859121940">
     <w:abstractNumId w:val="16"/>
   </w:num>
   <w:num w:numId="28" w16cid:durableId="897590530">
-    <w:abstractNumId w:val="25"/>
+    <w:abstractNumId w:val="26"/>
   </w:num>
   <w:num w:numId="29" w16cid:durableId="944965810">
     <w:abstractNumId w:val="21"/>
@@ -14398,10 +14228,13 @@
     <w:abstractNumId w:val="18"/>
   </w:num>
   <w:num w:numId="31" w16cid:durableId="725565626">
-    <w:abstractNumId w:val="23"/>
+    <w:abstractNumId w:val="24"/>
   </w:num>
   <w:num w:numId="32" w16cid:durableId="1521549819">
     <w:abstractNumId w:val="12"/>
+  </w:num>
+  <w:num w:numId="33" w16cid:durableId="346636103">
+    <w:abstractNumId w:val="22"/>
   </w:num>
 </w:numbering>
 </file>
@@ -14520,7 +14353,7 @@
     <w:lsdException w:name="E-mail Signature" w:semiHidden="1" w:unhideWhenUsed="1"/>
     <w:lsdException w:name="HTML Top of Form" w:semiHidden="1" w:unhideWhenUsed="1"/>
     <w:lsdException w:name="HTML Bottom of Form" w:semiHidden="1" w:unhideWhenUsed="1"/>
-    <w:lsdException w:name="Normal (Web)" w:semiHidden="1" w:unhideWhenUsed="1"/>
+    <w:lsdException w:name="Normal (Web)" w:semiHidden="1" w:unhideWhenUsed="1" w:qFormat="1"/>
     <w:lsdException w:name="HTML Acronym" w:semiHidden="1" w:unhideWhenUsed="1"/>
     <w:lsdException w:name="HTML Address" w:semiHidden="1" w:unhideWhenUsed="1"/>
     <w:lsdException w:name="HTML Cite" w:semiHidden="1" w:unhideWhenUsed="1"/>
@@ -14962,6 +14795,7 @@
     <w:basedOn w:val="Normale"/>
     <w:uiPriority w:val="99"/>
     <w:unhideWhenUsed/>
+    <w:qFormat/>
     <w:rsid w:val="0000731C"/>
     <w:pPr>
       <w:widowControl/>

</xml_diff>